<commit_message>
Add Problems Faced sections: Chapter I sub-section + cross-project Appendix A
Two additions threading explicit problem/cause/resolution structure
into the journal:

1. Chapter I gains a 'Problems Faced in Chapter I' sub-section
   covering the six foundational problems (4-hour fantasy,
   proprietary grid data, page-isn't-responding freeze, DOM
   marker render cost, O(N) nearest-outage scan, cross-language
   PRNG bit-mismatch risk) in a Problem / Root cause / Resolution
   table.

2. New Appendix A at the end: a single 24-row cross-project
   catalogue covering every significant problem the project hit,
   organized by chapter, with explicit root cause and resolution
   for each. Closes with a 'Patterns across the catalogue' block
   summarizing recurring lessons (optional deps, real
   measurements, semantic bugs, skipping work, visualization
   parity).

Both JOURNAL.html and Hartford_Grid_Dev_Journal.docx updated.

Co-Authored-By: Claude Opus 4.7 <noreply@anthropic.com>
</commit_message>
<xml_diff>
--- a/Hartford_Grid_Dev_Journal.docx
+++ b/Hartford_Grid_Dev_Journal.docx
@@ -3696,6 +3696,547 @@
           <w:color w:val="5B4528"/>
           <w:sz w:val="24"/>
         </w:rPr>
+        <w:t>Problems Faced in Chapter I</w:t>
+      </w:r>
+    </w:p>
+    <w:p>
+      <w:r>
+        <w:rPr>
+          <w:rFonts w:ascii="Georgia" w:hAnsi="Georgia"/>
+          <w:b w:val="0"/>
+          <w:i/>
+          <w:color w:val="705638"/>
+          <w:sz w:val="20"/>
+        </w:rPr>
+        <w:t>Every interesting bit of engineering in the foundations existed because something didn't work the obvious way first.</w:t>
+      </w:r>
+    </w:p>
+    <w:tbl>
+      <w:tblPr>
+        <w:tblW w:type="auto" w:w="0"/>
+        <w:tblLook w:firstColumn="1" w:firstRow="1" w:lastColumn="0" w:lastRow="0" w:noHBand="0" w:noVBand="1" w:val="04A0"/>
+      </w:tblPr>
+      <w:tblGrid>
+        <w:gridCol w:w="3216"/>
+        <w:gridCol w:w="3216"/>
+        <w:gridCol w:w="3216"/>
+      </w:tblGrid>
+      <w:tr>
+        <w:tc>
+          <w:tcPr>
+            <w:tcW w:type="dxa" w:w="1296"/>
+            <w:shd w:val="clear" w:color="auto" w:fill="F3E8C8"/>
+            <w:tcBorders>
+              <w:top w:val="single" w:sz="4" w:color="C9B894"/>
+              <w:left w:val="single" w:sz="4" w:color="C9B894"/>
+              <w:bottom w:val="single" w:sz="4" w:color="C9B894"/>
+              <w:right w:val="single" w:sz="4" w:color="C9B894"/>
+            </w:tcBorders>
+          </w:tcPr>
+          <w:p>
+            <w:r>
+              <w:rPr>
+                <w:rFonts w:ascii="Georgia" w:hAnsi="Georgia"/>
+                <w:b/>
+                <w:i w:val="0"/>
+                <w:color w:val="5B4528"/>
+                <w:sz w:val="20"/>
+              </w:rPr>
+              <w:t>WHEN</w:t>
+            </w:r>
+          </w:p>
+        </w:tc>
+        <w:tc>
+          <w:tcPr>
+            <w:tcW w:type="dxa" w:w="1440"/>
+            <w:shd w:val="clear" w:color="auto" w:fill="F3E8C8"/>
+            <w:tcBorders>
+              <w:top w:val="single" w:sz="4" w:color="C9B894"/>
+              <w:left w:val="single" w:sz="4" w:color="C9B894"/>
+              <w:bottom w:val="single" w:sz="4" w:color="C9B894"/>
+              <w:right w:val="single" w:sz="4" w:color="C9B894"/>
+            </w:tcBorders>
+          </w:tcPr>
+          <w:p>
+            <w:r>
+              <w:rPr>
+                <w:rFonts w:ascii="Georgia" w:hAnsi="Georgia"/>
+                <w:b/>
+                <w:i w:val="0"/>
+                <w:color w:val="5B4528"/>
+                <w:sz w:val="20"/>
+              </w:rPr>
+              <w:t>KIND</w:t>
+            </w:r>
+          </w:p>
+        </w:tc>
+        <w:tc>
+          <w:tcPr>
+            <w:tcW w:type="dxa" w:w="6480"/>
+            <w:shd w:val="clear" w:color="auto" w:fill="F3E8C8"/>
+            <w:tcBorders>
+              <w:top w:val="single" w:sz="4" w:color="C9B894"/>
+              <w:left w:val="single" w:sz="4" w:color="C9B894"/>
+              <w:bottom w:val="single" w:sz="4" w:color="C9B894"/>
+              <w:right w:val="single" w:sz="4" w:color="C9B894"/>
+            </w:tcBorders>
+          </w:tcPr>
+          <w:p>
+            <w:r>
+              <w:rPr>
+                <w:rFonts w:ascii="Georgia" w:hAnsi="Georgia"/>
+                <w:b/>
+                <w:i w:val="0"/>
+                <w:color w:val="5B4528"/>
+                <w:sz w:val="20"/>
+              </w:rPr>
+              <w:t>ENTRY</w:t>
+            </w:r>
+          </w:p>
+        </w:tc>
+      </w:tr>
+      <w:tr>
+        <w:tc>
+          <w:tcPr>
+            <w:tcW w:type="dxa" w:w="1296"/>
+            <w:tcBorders>
+              <w:top w:val="single" w:sz="4" w:color="C9B894"/>
+              <w:left w:val="single" w:sz="4" w:color="C9B894"/>
+              <w:bottom w:val="single" w:sz="4" w:color="C9B894"/>
+              <w:right w:val="single" w:sz="4" w:color="C9B894"/>
+            </w:tcBorders>
+          </w:tcPr>
+          <w:p>
+            <w:r>
+              <w:rPr>
+                <w:rFonts w:ascii="Georgia" w:hAnsi="Georgia"/>
+                <w:b w:val="0"/>
+                <w:i/>
+                <w:color w:val="705638"/>
+                <w:sz w:val="20"/>
+              </w:rPr>
+              <w:t>"4-hour fantasy"</w:t>
+            </w:r>
+          </w:p>
+        </w:tc>
+        <w:tc>
+          <w:tcPr>
+            <w:tcW w:type="dxa" w:w="1440"/>
+            <w:tcBorders>
+              <w:top w:val="single" w:sz="4" w:color="C9B894"/>
+              <w:left w:val="single" w:sz="4" w:color="C9B894"/>
+              <w:bottom w:val="single" w:sz="4" w:color="C9B894"/>
+              <w:right w:val="single" w:sz="4" w:color="C9B894"/>
+            </w:tcBorders>
+            <w:shd w:val="clear" w:color="auto" w:fill="FFFFFF"/>
+          </w:tcPr>
+          <w:p>
+            <w:r>
+              <w:rPr>
+                <w:rFonts w:ascii="Georgia" w:hAnsi="Georgia"/>
+                <w:b/>
+                <w:i w:val="0"/>
+                <w:color w:val="3B2F24"/>
+                <w:sz w:val="20"/>
+              </w:rPr>
+              <w:t>Realism gap</w:t>
+            </w:r>
+          </w:p>
+        </w:tc>
+        <w:tc>
+          <w:tcPr>
+            <w:tcW w:type="dxa" w:w="6480"/>
+            <w:tcBorders>
+              <w:top w:val="single" w:sz="4" w:color="C9B894"/>
+              <w:left w:val="single" w:sz="4" w:color="C9B894"/>
+              <w:bottom w:val="single" w:sz="4" w:color="C9B894"/>
+              <w:right w:val="single" w:sz="4" w:color="C9B894"/>
+            </w:tcBorders>
+          </w:tcPr>
+          <w:p>
+            <w:r>
+              <w:rPr>
+                <w:rFonts w:ascii="Georgia" w:hAnsi="Georgia"/>
+                <w:b w:val="0"/>
+                <w:i w:val="0"/>
+                <w:color w:val="3B2F24"/>
+                <w:sz w:val="22"/>
+              </w:rPr>
+              <w:t>Cause: naïve scheduler ignored real-world delays; predicted 4 h vs reality 2–7 d. Resolution: the seven realism factors of I.5, layered with literature-backed parameter choices, brought the simulation into order-of-magnitude agreement with published event timelines.</w:t>
+            </w:r>
+          </w:p>
+        </w:tc>
+      </w:tr>
+      <w:tr>
+        <w:tc>
+          <w:tcPr>
+            <w:tcW w:type="dxa" w:w="1296"/>
+            <w:tcBorders>
+              <w:top w:val="single" w:sz="4" w:color="C9B894"/>
+              <w:left w:val="single" w:sz="4" w:color="C9B894"/>
+              <w:bottom w:val="single" w:sz="4" w:color="C9B894"/>
+              <w:right w:val="single" w:sz="4" w:color="C9B894"/>
+            </w:tcBorders>
+          </w:tcPr>
+          <w:p>
+            <w:r>
+              <w:rPr>
+                <w:rFonts w:ascii="Georgia" w:hAnsi="Georgia"/>
+                <w:b w:val="0"/>
+                <w:i/>
+                <w:color w:val="705638"/>
+                <w:sz w:val="20"/>
+              </w:rPr>
+              <w:t>Proprietary grid data</w:t>
+            </w:r>
+          </w:p>
+        </w:tc>
+        <w:tc>
+          <w:tcPr>
+            <w:tcW w:type="dxa" w:w="1440"/>
+            <w:tcBorders>
+              <w:top w:val="single" w:sz="4" w:color="C9B894"/>
+              <w:left w:val="single" w:sz="4" w:color="C9B894"/>
+              <w:bottom w:val="single" w:sz="4" w:color="C9B894"/>
+              <w:right w:val="single" w:sz="4" w:color="C9B894"/>
+            </w:tcBorders>
+            <w:shd w:val="clear" w:color="auto" w:fill="FFFFFF"/>
+          </w:tcPr>
+          <w:p>
+            <w:r>
+              <w:rPr>
+                <w:rFonts w:ascii="Georgia" w:hAnsi="Georgia"/>
+                <w:b/>
+                <w:i w:val="0"/>
+                <w:color w:val="3B2F24"/>
+                <w:sz w:val="20"/>
+              </w:rPr>
+              <w:t>Data unavailable</w:t>
+            </w:r>
+          </w:p>
+        </w:tc>
+        <w:tc>
+          <w:tcPr>
+            <w:tcW w:type="dxa" w:w="6480"/>
+            <w:tcBorders>
+              <w:top w:val="single" w:sz="4" w:color="C9B894"/>
+              <w:left w:val="single" w:sz="4" w:color="C9B894"/>
+              <w:bottom w:val="single" w:sz="4" w:color="C9B894"/>
+              <w:right w:val="single" w:sz="4" w:color="C9B894"/>
+            </w:tcBorders>
+          </w:tcPr>
+          <w:p>
+            <w:r>
+              <w:rPr>
+                <w:rFonts w:ascii="Georgia" w:hAnsi="Georgia"/>
+                <w:b w:val="0"/>
+                <w:i w:val="0"/>
+                <w:color w:val="3B2F24"/>
+                <w:sz w:val="22"/>
+              </w:rPr>
+              <w:t>Cause: Eversource's real feeder topology isn't public — partly competitive, partly physical-security. Resolution: synthetic distribution grid from population-weighted demand + k-means substations + radial feeders. Reproducible from a single seed.</w:t>
+            </w:r>
+          </w:p>
+        </w:tc>
+      </w:tr>
+      <w:tr>
+        <w:tc>
+          <w:tcPr>
+            <w:tcW w:type="dxa" w:w="1296"/>
+            <w:tcBorders>
+              <w:top w:val="single" w:sz="4" w:color="C9B894"/>
+              <w:left w:val="single" w:sz="4" w:color="C9B894"/>
+              <w:bottom w:val="single" w:sz="4" w:color="C9B894"/>
+              <w:right w:val="single" w:sz="4" w:color="C9B894"/>
+            </w:tcBorders>
+          </w:tcPr>
+          <w:p>
+            <w:r>
+              <w:rPr>
+                <w:rFonts w:ascii="Georgia" w:hAnsi="Georgia"/>
+                <w:b w:val="0"/>
+                <w:i/>
+                <w:color w:val="705638"/>
+                <w:sz w:val="20"/>
+              </w:rPr>
+              <w:t>"Page isn't responding"</w:t>
+            </w:r>
+          </w:p>
+        </w:tc>
+        <w:tc>
+          <w:tcPr>
+            <w:tcW w:type="dxa" w:w="1440"/>
+            <w:tcBorders>
+              <w:top w:val="single" w:sz="4" w:color="C9B894"/>
+              <w:left w:val="single" w:sz="4" w:color="C9B894"/>
+              <w:bottom w:val="single" w:sz="4" w:color="C9B894"/>
+              <w:right w:val="single" w:sz="4" w:color="C9B894"/>
+            </w:tcBorders>
+            <w:shd w:val="clear" w:color="auto" w:fill="FFFFFF"/>
+          </w:tcPr>
+          <w:p>
+            <w:r>
+              <w:rPr>
+                <w:rFonts w:ascii="Georgia" w:hAnsi="Georgia"/>
+                <w:b/>
+                <w:i w:val="0"/>
+                <w:color w:val="3B2F24"/>
+                <w:sz w:val="20"/>
+              </w:rPr>
+              <w:t>Compute blocks UI</w:t>
+            </w:r>
+          </w:p>
+        </w:tc>
+        <w:tc>
+          <w:tcPr>
+            <w:tcW w:type="dxa" w:w="6480"/>
+            <w:tcBorders>
+              <w:top w:val="single" w:sz="4" w:color="C9B894"/>
+              <w:left w:val="single" w:sz="4" w:color="C9B894"/>
+              <w:bottom w:val="single" w:sz="4" w:color="C9B894"/>
+              <w:right w:val="single" w:sz="4" w:color="C9B894"/>
+            </w:tcBorders>
+          </w:tcPr>
+          <w:p>
+            <w:r>
+              <w:rPr>
+                <w:rFonts w:ascii="Georgia" w:hAnsi="Georgia"/>
+                <w:b w:val="0"/>
+                <w:i w:val="0"/>
+                <w:color w:val="3B2F24"/>
+                <w:sz w:val="22"/>
+              </w:rPr>
+              <w:t>Cause: the scheduler dispatch loop never yielded to the browser event loop at N=1500+. Resolution: chunk the loop and await new Promise(r =&gt; setTimeout(r, 0)) every ~500 dispatches.</w:t>
+            </w:r>
+          </w:p>
+        </w:tc>
+      </w:tr>
+      <w:tr>
+        <w:tc>
+          <w:tcPr>
+            <w:tcW w:type="dxa" w:w="1296"/>
+            <w:tcBorders>
+              <w:top w:val="single" w:sz="4" w:color="C9B894"/>
+              <w:left w:val="single" w:sz="4" w:color="C9B894"/>
+              <w:bottom w:val="single" w:sz="4" w:color="C9B894"/>
+              <w:right w:val="single" w:sz="4" w:color="C9B894"/>
+            </w:tcBorders>
+          </w:tcPr>
+          <w:p>
+            <w:r>
+              <w:rPr>
+                <w:rFonts w:ascii="Georgia" w:hAnsi="Georgia"/>
+                <w:b w:val="0"/>
+                <w:i/>
+                <w:color w:val="705638"/>
+                <w:sz w:val="20"/>
+              </w:rPr>
+              <w:t>DOM markers slow at scale</w:t>
+            </w:r>
+          </w:p>
+        </w:tc>
+        <w:tc>
+          <w:tcPr>
+            <w:tcW w:type="dxa" w:w="1440"/>
+            <w:tcBorders>
+              <w:top w:val="single" w:sz="4" w:color="C9B894"/>
+              <w:left w:val="single" w:sz="4" w:color="C9B894"/>
+              <w:bottom w:val="single" w:sz="4" w:color="C9B894"/>
+              <w:right w:val="single" w:sz="4" w:color="C9B894"/>
+            </w:tcBorders>
+            <w:shd w:val="clear" w:color="auto" w:fill="FFFFFF"/>
+          </w:tcPr>
+          <w:p>
+            <w:r>
+              <w:rPr>
+                <w:rFonts w:ascii="Georgia" w:hAnsi="Georgia"/>
+                <w:b/>
+                <w:i w:val="0"/>
+                <w:color w:val="3B2F24"/>
+                <w:sz w:val="20"/>
+              </w:rPr>
+              <w:t>Render cost</w:t>
+            </w:r>
+          </w:p>
+        </w:tc>
+        <w:tc>
+          <w:tcPr>
+            <w:tcW w:type="dxa" w:w="6480"/>
+            <w:tcBorders>
+              <w:top w:val="single" w:sz="4" w:color="C9B894"/>
+              <w:left w:val="single" w:sz="4" w:color="C9B894"/>
+              <w:bottom w:val="single" w:sz="4" w:color="C9B894"/>
+              <w:right w:val="single" w:sz="4" w:color="C9B894"/>
+            </w:tcBorders>
+          </w:tcPr>
+          <w:p>
+            <w:r>
+              <w:rPr>
+                <w:rFonts w:ascii="Georgia" w:hAnsi="Georgia"/>
+                <w:b w:val="0"/>
+                <w:i w:val="0"/>
+                <w:color w:val="3B2F24"/>
+                <w:sz w:val="22"/>
+              </w:rPr>
+              <w:t>Cause: each L.marker creates an HTML element; 10 000 markers = seconds. Resolution: custom PointCloudLayer canvas renderer; numbered HTML markers up to a budget; canvas dots beyond.</w:t>
+            </w:r>
+          </w:p>
+        </w:tc>
+      </w:tr>
+      <w:tr>
+        <w:tc>
+          <w:tcPr>
+            <w:tcW w:type="dxa" w:w="1296"/>
+            <w:tcBorders>
+              <w:top w:val="single" w:sz="4" w:color="C9B894"/>
+              <w:left w:val="single" w:sz="4" w:color="C9B894"/>
+              <w:bottom w:val="single" w:sz="4" w:color="C9B894"/>
+              <w:right w:val="single" w:sz="4" w:color="C9B894"/>
+            </w:tcBorders>
+          </w:tcPr>
+          <w:p>
+            <w:r>
+              <w:rPr>
+                <w:rFonts w:ascii="Georgia" w:hAnsi="Georgia"/>
+                <w:b w:val="0"/>
+                <w:i/>
+                <w:color w:val="705638"/>
+                <w:sz w:val="20"/>
+              </w:rPr>
+              <w:t>O(N) nearest-outage scan</w:t>
+            </w:r>
+          </w:p>
+        </w:tc>
+        <w:tc>
+          <w:tcPr>
+            <w:tcW w:type="dxa" w:w="1440"/>
+            <w:tcBorders>
+              <w:top w:val="single" w:sz="4" w:color="C9B894"/>
+              <w:left w:val="single" w:sz="4" w:color="C9B894"/>
+              <w:bottom w:val="single" w:sz="4" w:color="C9B894"/>
+              <w:right w:val="single" w:sz="4" w:color="C9B894"/>
+            </w:tcBorders>
+            <w:shd w:val="clear" w:color="auto" w:fill="FFFFFF"/>
+          </w:tcPr>
+          <w:p>
+            <w:r>
+              <w:rPr>
+                <w:rFonts w:ascii="Georgia" w:hAnsi="Georgia"/>
+                <w:b/>
+                <w:i w:val="0"/>
+                <w:color w:val="3B2F24"/>
+                <w:sz w:val="20"/>
+              </w:rPr>
+              <w:t>Algorithmic</w:t>
+            </w:r>
+          </w:p>
+        </w:tc>
+        <w:tc>
+          <w:tcPr>
+            <w:tcW w:type="dxa" w:w="6480"/>
+            <w:tcBorders>
+              <w:top w:val="single" w:sz="4" w:color="C9B894"/>
+              <w:left w:val="single" w:sz="4" w:color="C9B894"/>
+              <w:bottom w:val="single" w:sz="4" w:color="C9B894"/>
+              <w:right w:val="single" w:sz="4" w:color="C9B894"/>
+            </w:tcBorders>
+          </w:tcPr>
+          <w:p>
+            <w:r>
+              <w:rPr>
+                <w:rFonts w:ascii="Georgia" w:hAnsi="Georgia"/>
+                <w:b w:val="0"/>
+                <w:i w:val="0"/>
+                <w:color w:val="3B2F24"/>
+                <w:sz w:val="22"/>
+              </w:rPr>
+              <w:t>Cause: inner search scans all outages every dispatch. Resolution: JS-side spatial grid hash with ring expansion. Same idea reappears in scheduler_numba.py later.</w:t>
+            </w:r>
+          </w:p>
+        </w:tc>
+      </w:tr>
+      <w:tr>
+        <w:tc>
+          <w:tcPr>
+            <w:tcW w:type="dxa" w:w="1296"/>
+            <w:tcBorders>
+              <w:top w:val="single" w:sz="4" w:color="C9B894"/>
+              <w:left w:val="single" w:sz="4" w:color="C9B894"/>
+              <w:bottom w:val="single" w:sz="4" w:color="C9B894"/>
+              <w:right w:val="single" w:sz="4" w:color="C9B894"/>
+            </w:tcBorders>
+          </w:tcPr>
+          <w:p>
+            <w:r>
+              <w:rPr>
+                <w:rFonts w:ascii="Georgia" w:hAnsi="Georgia"/>
+                <w:b w:val="0"/>
+                <w:i/>
+                <w:color w:val="705638"/>
+                <w:sz w:val="20"/>
+              </w:rPr>
+              <w:t>PRNG bit-mismatch risk</w:t>
+            </w:r>
+          </w:p>
+        </w:tc>
+        <w:tc>
+          <w:tcPr>
+            <w:tcW w:type="dxa" w:w="1440"/>
+            <w:tcBorders>
+              <w:top w:val="single" w:sz="4" w:color="C9B894"/>
+              <w:left w:val="single" w:sz="4" w:color="C9B894"/>
+              <w:bottom w:val="single" w:sz="4" w:color="C9B894"/>
+              <w:right w:val="single" w:sz="4" w:color="C9B894"/>
+            </w:tcBorders>
+            <w:shd w:val="clear" w:color="auto" w:fill="FFFFFF"/>
+          </w:tcPr>
+          <w:p>
+            <w:r>
+              <w:rPr>
+                <w:rFonts w:ascii="Georgia" w:hAnsi="Georgia"/>
+                <w:b/>
+                <w:i w:val="0"/>
+                <w:color w:val="3B2F24"/>
+                <w:sz w:val="20"/>
+              </w:rPr>
+              <w:t>Reproducibility</w:t>
+            </w:r>
+          </w:p>
+        </w:tc>
+        <w:tc>
+          <w:tcPr>
+            <w:tcW w:type="dxa" w:w="6480"/>
+            <w:tcBorders>
+              <w:top w:val="single" w:sz="4" w:color="C9B894"/>
+              <w:left w:val="single" w:sz="4" w:color="C9B894"/>
+              <w:bottom w:val="single" w:sz="4" w:color="C9B894"/>
+              <w:right w:val="single" w:sz="4" w:color="C9B894"/>
+            </w:tcBorders>
+          </w:tcPr>
+          <w:p>
+            <w:r>
+              <w:rPr>
+                <w:rFonts w:ascii="Georgia" w:hAnsi="Georgia"/>
+                <w:b w:val="0"/>
+                <w:i w:val="0"/>
+                <w:color w:val="3B2F24"/>
+                <w:sz w:val="22"/>
+              </w:rPr>
+              <w:t>Cause: for an offline Python artifact generator to match the browser, Mulberry32 had to be identical at every bit including integer-overflow semantics. Resolution: explicit &amp; 0xFFFFFFFF masks in both languages plus a head-to-head 10 000-sample comparison test before anything was committed.</w:t>
+            </w:r>
+          </w:p>
+        </w:tc>
+      </w:tr>
+    </w:tbl>
+    <w:p>
+      <w:r>
+        <w:rPr>
+          <w:rFonts w:ascii="Georgia" w:hAnsi="Georgia"/>
+          <w:b/>
+          <w:i w:val="0"/>
+          <w:color w:val="5B4528"/>
+          <w:sz w:val="24"/>
+        </w:rPr>
         <w:t>Takeaways from Chapter I</w:t>
       </w:r>
     </w:p>
@@ -11419,6 +11960,1945 @@
           <w:sz w:val="22"/>
         </w:rPr>
         <w:t>What's live now: a public-facing simulator that auto-detects its own server backend, falls back gracefully when offline, handles 100 000-outage scenarios in under a second, and renders the per-crew dispatch sequence as colored numbered circles on a Leaflet map of Hartford County. The road ahead is MILP comparison for academic rigor and PURA-grounded calibration for real-world claims. The engineering substrate is done; what remains is the research story it can now support.</w:t>
+      </w:r>
+    </w:p>
+    <w:p>
+      <w:pPr>
+        <w:jc w:val="center"/>
+      </w:pPr>
+      <w:r>
+        <w:rPr>
+          <w:rFonts w:ascii="Georgia" w:hAnsi="Georgia"/>
+          <w:b w:val="0"/>
+          <w:i w:val="0"/>
+          <w:color w:val="8B3A2E"/>
+          <w:sz w:val="28"/>
+        </w:rPr>
+        <w:t>❦</w:t>
+      </w:r>
+    </w:p>
+    <w:p>
+      <w:r>
+        <w:rPr>
+          <w:rFonts w:ascii="Georgia" w:hAnsi="Georgia"/>
+          <w:b/>
+          <w:i w:val="0"/>
+          <w:color w:val="8B3A2E"/>
+          <w:sz w:val="30"/>
+        </w:rPr>
+        <w:t>Appendix A — Problems Faced (Cross-Project Catalogue)</w:t>
+      </w:r>
+    </w:p>
+    <w:p>
+      <w:r>
+        <w:rPr>
+          <w:rFonts w:ascii="Georgia" w:hAnsi="Georgia"/>
+          <w:b w:val="0"/>
+          <w:i/>
+          <w:color w:val="705638"/>
+          <w:sz w:val="20"/>
+        </w:rPr>
+        <w:t>Every significant problem the project hit, in order, with root cause and resolution. Useful as a debugging-pattern reference for the next person doing this kind of work.</w:t>
+      </w:r>
+    </w:p>
+    <w:tbl>
+      <w:tblPr>
+        <w:tblW w:type="auto" w:w="0"/>
+        <w:tblLook w:firstColumn="1" w:firstRow="1" w:lastColumn="0" w:lastRow="0" w:noHBand="0" w:noVBand="1" w:val="04A0"/>
+      </w:tblPr>
+      <w:tblGrid>
+        <w:gridCol w:w="3216"/>
+        <w:gridCol w:w="3216"/>
+        <w:gridCol w:w="3216"/>
+      </w:tblGrid>
+      <w:tr>
+        <w:tc>
+          <w:tcPr>
+            <w:tcW w:type="dxa" w:w="1296"/>
+            <w:shd w:val="clear" w:color="auto" w:fill="F3E8C8"/>
+            <w:tcBorders>
+              <w:top w:val="single" w:sz="4" w:color="C9B894"/>
+              <w:left w:val="single" w:sz="4" w:color="C9B894"/>
+              <w:bottom w:val="single" w:sz="4" w:color="C9B894"/>
+              <w:right w:val="single" w:sz="4" w:color="C9B894"/>
+            </w:tcBorders>
+          </w:tcPr>
+          <w:p>
+            <w:r>
+              <w:rPr>
+                <w:rFonts w:ascii="Georgia" w:hAnsi="Georgia"/>
+                <w:b/>
+                <w:i w:val="0"/>
+                <w:color w:val="5B4528"/>
+                <w:sz w:val="20"/>
+              </w:rPr>
+              <w:t>WHEN</w:t>
+            </w:r>
+          </w:p>
+        </w:tc>
+        <w:tc>
+          <w:tcPr>
+            <w:tcW w:type="dxa" w:w="1440"/>
+            <w:shd w:val="clear" w:color="auto" w:fill="F3E8C8"/>
+            <w:tcBorders>
+              <w:top w:val="single" w:sz="4" w:color="C9B894"/>
+              <w:left w:val="single" w:sz="4" w:color="C9B894"/>
+              <w:bottom w:val="single" w:sz="4" w:color="C9B894"/>
+              <w:right w:val="single" w:sz="4" w:color="C9B894"/>
+            </w:tcBorders>
+          </w:tcPr>
+          <w:p>
+            <w:r>
+              <w:rPr>
+                <w:rFonts w:ascii="Georgia" w:hAnsi="Georgia"/>
+                <w:b/>
+                <w:i w:val="0"/>
+                <w:color w:val="5B4528"/>
+                <w:sz w:val="20"/>
+              </w:rPr>
+              <w:t>KIND</w:t>
+            </w:r>
+          </w:p>
+        </w:tc>
+        <w:tc>
+          <w:tcPr>
+            <w:tcW w:type="dxa" w:w="6480"/>
+            <w:shd w:val="clear" w:color="auto" w:fill="F3E8C8"/>
+            <w:tcBorders>
+              <w:top w:val="single" w:sz="4" w:color="C9B894"/>
+              <w:left w:val="single" w:sz="4" w:color="C9B894"/>
+              <w:bottom w:val="single" w:sz="4" w:color="C9B894"/>
+              <w:right w:val="single" w:sz="4" w:color="C9B894"/>
+            </w:tcBorders>
+          </w:tcPr>
+          <w:p>
+            <w:r>
+              <w:rPr>
+                <w:rFonts w:ascii="Georgia" w:hAnsi="Georgia"/>
+                <w:b/>
+                <w:i w:val="0"/>
+                <w:color w:val="5B4528"/>
+                <w:sz w:val="20"/>
+              </w:rPr>
+              <w:t>ENTRY</w:t>
+            </w:r>
+          </w:p>
+        </w:tc>
+      </w:tr>
+      <w:tr>
+        <w:tc>
+          <w:tcPr>
+            <w:tcW w:type="dxa" w:w="1296"/>
+            <w:tcBorders>
+              <w:top w:val="single" w:sz="4" w:color="C9B894"/>
+              <w:left w:val="single" w:sz="4" w:color="C9B894"/>
+              <w:bottom w:val="single" w:sz="4" w:color="C9B894"/>
+              <w:right w:val="single" w:sz="4" w:color="C9B894"/>
+            </w:tcBorders>
+          </w:tcPr>
+          <w:p>
+            <w:r>
+              <w:rPr>
+                <w:rFonts w:ascii="Georgia" w:hAnsi="Georgia"/>
+                <w:b w:val="0"/>
+                <w:i/>
+                <w:color w:val="705638"/>
+                <w:sz w:val="20"/>
+              </w:rPr>
+              <w:t>I</w:t>
+            </w:r>
+          </w:p>
+        </w:tc>
+        <w:tc>
+          <w:tcPr>
+            <w:tcW w:type="dxa" w:w="1440"/>
+            <w:tcBorders>
+              <w:top w:val="single" w:sz="4" w:color="C9B894"/>
+              <w:left w:val="single" w:sz="4" w:color="C9B894"/>
+              <w:bottom w:val="single" w:sz="4" w:color="C9B894"/>
+              <w:right w:val="single" w:sz="4" w:color="C9B894"/>
+            </w:tcBorders>
+            <w:shd w:val="clear" w:color="auto" w:fill="DCFCE7"/>
+          </w:tcPr>
+          <w:p>
+            <w:r>
+              <w:rPr>
+                <w:rFonts w:ascii="Georgia" w:hAnsi="Georgia"/>
+                <w:b/>
+                <w:i w:val="0"/>
+                <w:color w:val="15803D"/>
+                <w:sz w:val="20"/>
+              </w:rPr>
+              <w:t>Fix — "4-hour fantasy"</w:t>
+            </w:r>
+          </w:p>
+        </w:tc>
+        <w:tc>
+          <w:tcPr>
+            <w:tcW w:type="dxa" w:w="6480"/>
+            <w:tcBorders>
+              <w:top w:val="single" w:sz="4" w:color="C9B894"/>
+              <w:left w:val="single" w:sz="4" w:color="C9B894"/>
+              <w:bottom w:val="single" w:sz="4" w:color="C9B894"/>
+              <w:right w:val="single" w:sz="4" w:color="C9B894"/>
+            </w:tcBorders>
+          </w:tcPr>
+          <w:p>
+            <w:r>
+              <w:rPr>
+                <w:rFonts w:ascii="Georgia" w:hAnsi="Georgia"/>
+                <w:b w:val="0"/>
+                <w:i w:val="0"/>
+                <w:color w:val="3B2F24"/>
+                <w:sz w:val="22"/>
+              </w:rPr>
+              <w:t>Cause: naïve scheduler ignored real-world delays; predicted 4 h vs reality 2–7 d. Resolution: seven multiplicative realism factors (assessment, repair, discovery ramp, mutual-aid waves, road proxy, workday clamp, critical priority).</w:t>
+            </w:r>
+          </w:p>
+        </w:tc>
+      </w:tr>
+      <w:tr>
+        <w:tc>
+          <w:tcPr>
+            <w:tcW w:type="dxa" w:w="1296"/>
+            <w:tcBorders>
+              <w:top w:val="single" w:sz="4" w:color="C9B894"/>
+              <w:left w:val="single" w:sz="4" w:color="C9B894"/>
+              <w:bottom w:val="single" w:sz="4" w:color="C9B894"/>
+              <w:right w:val="single" w:sz="4" w:color="C9B894"/>
+            </w:tcBorders>
+          </w:tcPr>
+          <w:p>
+            <w:r>
+              <w:rPr>
+                <w:rFonts w:ascii="Georgia" w:hAnsi="Georgia"/>
+                <w:b w:val="0"/>
+                <w:i/>
+                <w:color w:val="705638"/>
+                <w:sz w:val="20"/>
+              </w:rPr>
+              <w:t>I</w:t>
+            </w:r>
+          </w:p>
+        </w:tc>
+        <w:tc>
+          <w:tcPr>
+            <w:tcW w:type="dxa" w:w="1440"/>
+            <w:tcBorders>
+              <w:top w:val="single" w:sz="4" w:color="C9B894"/>
+              <w:left w:val="single" w:sz="4" w:color="C9B894"/>
+              <w:bottom w:val="single" w:sz="4" w:color="C9B894"/>
+              <w:right w:val="single" w:sz="4" w:color="C9B894"/>
+            </w:tcBorders>
+            <w:shd w:val="clear" w:color="auto" w:fill="DCFCE7"/>
+          </w:tcPr>
+          <w:p>
+            <w:r>
+              <w:rPr>
+                <w:rFonts w:ascii="Georgia" w:hAnsi="Georgia"/>
+                <w:b/>
+                <w:i w:val="0"/>
+                <w:color w:val="15803D"/>
+                <w:sz w:val="20"/>
+              </w:rPr>
+              <w:t>Fix — "Page isn't responding"</w:t>
+            </w:r>
+          </w:p>
+        </w:tc>
+        <w:tc>
+          <w:tcPr>
+            <w:tcW w:type="dxa" w:w="6480"/>
+            <w:tcBorders>
+              <w:top w:val="single" w:sz="4" w:color="C9B894"/>
+              <w:left w:val="single" w:sz="4" w:color="C9B894"/>
+              <w:bottom w:val="single" w:sz="4" w:color="C9B894"/>
+              <w:right w:val="single" w:sz="4" w:color="C9B894"/>
+            </w:tcBorders>
+          </w:tcPr>
+          <w:p>
+            <w:r>
+              <w:rPr>
+                <w:rFonts w:ascii="Georgia" w:hAnsi="Georgia"/>
+                <w:b w:val="0"/>
+                <w:i w:val="0"/>
+                <w:color w:val="3B2F24"/>
+                <w:sz w:val="22"/>
+              </w:rPr>
+              <w:t>Cause: dispatch loop never yielded to the browser event loop at N=1500+. Resolution: async-yield chunking with await new Promise(r =&gt; setTimeout(r, 0)) every ~500 dispatches.</w:t>
+            </w:r>
+          </w:p>
+        </w:tc>
+      </w:tr>
+      <w:tr>
+        <w:tc>
+          <w:tcPr>
+            <w:tcW w:type="dxa" w:w="1296"/>
+            <w:tcBorders>
+              <w:top w:val="single" w:sz="4" w:color="C9B894"/>
+              <w:left w:val="single" w:sz="4" w:color="C9B894"/>
+              <w:bottom w:val="single" w:sz="4" w:color="C9B894"/>
+              <w:right w:val="single" w:sz="4" w:color="C9B894"/>
+            </w:tcBorders>
+          </w:tcPr>
+          <w:p>
+            <w:r>
+              <w:rPr>
+                <w:rFonts w:ascii="Georgia" w:hAnsi="Georgia"/>
+                <w:b w:val="0"/>
+                <w:i/>
+                <w:color w:val="705638"/>
+                <w:sz w:val="20"/>
+              </w:rPr>
+              <w:t>I</w:t>
+            </w:r>
+          </w:p>
+        </w:tc>
+        <w:tc>
+          <w:tcPr>
+            <w:tcW w:type="dxa" w:w="1440"/>
+            <w:tcBorders>
+              <w:top w:val="single" w:sz="4" w:color="C9B894"/>
+              <w:left w:val="single" w:sz="4" w:color="C9B894"/>
+              <w:bottom w:val="single" w:sz="4" w:color="C9B894"/>
+              <w:right w:val="single" w:sz="4" w:color="C9B894"/>
+            </w:tcBorders>
+            <w:shd w:val="clear" w:color="auto" w:fill="DCFCE7"/>
+          </w:tcPr>
+          <w:p>
+            <w:r>
+              <w:rPr>
+                <w:rFonts w:ascii="Georgia" w:hAnsi="Georgia"/>
+                <w:b/>
+                <w:i w:val="0"/>
+                <w:color w:val="15803D"/>
+                <w:sz w:val="20"/>
+              </w:rPr>
+              <w:t>Fix — DOM marker render cost</w:t>
+            </w:r>
+          </w:p>
+        </w:tc>
+        <w:tc>
+          <w:tcPr>
+            <w:tcW w:type="dxa" w:w="6480"/>
+            <w:tcBorders>
+              <w:top w:val="single" w:sz="4" w:color="C9B894"/>
+              <w:left w:val="single" w:sz="4" w:color="C9B894"/>
+              <w:bottom w:val="single" w:sz="4" w:color="C9B894"/>
+              <w:right w:val="single" w:sz="4" w:color="C9B894"/>
+            </w:tcBorders>
+          </w:tcPr>
+          <w:p>
+            <w:r>
+              <w:rPr>
+                <w:rFonts w:ascii="Georgia" w:hAnsi="Georgia"/>
+                <w:b w:val="0"/>
+                <w:i w:val="0"/>
+                <w:color w:val="3B2F24"/>
+                <w:sz w:val="22"/>
+              </w:rPr>
+              <w:t>Cause: each L.marker creates an HTML element; 10 000 markers take seconds. Resolution: custom PointCloudLayer canvas renderer for thousands of dots in a single pass.</w:t>
+            </w:r>
+          </w:p>
+        </w:tc>
+      </w:tr>
+      <w:tr>
+        <w:tc>
+          <w:tcPr>
+            <w:tcW w:type="dxa" w:w="1296"/>
+            <w:tcBorders>
+              <w:top w:val="single" w:sz="4" w:color="C9B894"/>
+              <w:left w:val="single" w:sz="4" w:color="C9B894"/>
+              <w:bottom w:val="single" w:sz="4" w:color="C9B894"/>
+              <w:right w:val="single" w:sz="4" w:color="C9B894"/>
+            </w:tcBorders>
+          </w:tcPr>
+          <w:p>
+            <w:r>
+              <w:rPr>
+                <w:rFonts w:ascii="Georgia" w:hAnsi="Georgia"/>
+                <w:b w:val="0"/>
+                <w:i/>
+                <w:color w:val="705638"/>
+                <w:sz w:val="20"/>
+              </w:rPr>
+              <w:t>I</w:t>
+            </w:r>
+          </w:p>
+        </w:tc>
+        <w:tc>
+          <w:tcPr>
+            <w:tcW w:type="dxa" w:w="1440"/>
+            <w:tcBorders>
+              <w:top w:val="single" w:sz="4" w:color="C9B894"/>
+              <w:left w:val="single" w:sz="4" w:color="C9B894"/>
+              <w:bottom w:val="single" w:sz="4" w:color="C9B894"/>
+              <w:right w:val="single" w:sz="4" w:color="C9B894"/>
+            </w:tcBorders>
+            <w:shd w:val="clear" w:color="auto" w:fill="DCFCE7"/>
+          </w:tcPr>
+          <w:p>
+            <w:r>
+              <w:rPr>
+                <w:rFonts w:ascii="Georgia" w:hAnsi="Georgia"/>
+                <w:b/>
+                <w:i w:val="0"/>
+                <w:color w:val="15803D"/>
+                <w:sz w:val="20"/>
+              </w:rPr>
+              <w:t>Fix — O(N) nearest-outage scan</w:t>
+            </w:r>
+          </w:p>
+        </w:tc>
+        <w:tc>
+          <w:tcPr>
+            <w:tcW w:type="dxa" w:w="6480"/>
+            <w:tcBorders>
+              <w:top w:val="single" w:sz="4" w:color="C9B894"/>
+              <w:left w:val="single" w:sz="4" w:color="C9B894"/>
+              <w:bottom w:val="single" w:sz="4" w:color="C9B894"/>
+              <w:right w:val="single" w:sz="4" w:color="C9B894"/>
+            </w:tcBorders>
+          </w:tcPr>
+          <w:p>
+            <w:r>
+              <w:rPr>
+                <w:rFonts w:ascii="Georgia" w:hAnsi="Georgia"/>
+                <w:b w:val="0"/>
+                <w:i w:val="0"/>
+                <w:color w:val="3B2F24"/>
+                <w:sz w:val="22"/>
+              </w:rPr>
+              <w:t>Cause: inner search scans all outages every dispatch. Resolution: JS-side spatial grid hash with ring expansion.</w:t>
+            </w:r>
+          </w:p>
+        </w:tc>
+      </w:tr>
+      <w:tr>
+        <w:tc>
+          <w:tcPr>
+            <w:tcW w:type="dxa" w:w="1296"/>
+            <w:tcBorders>
+              <w:top w:val="single" w:sz="4" w:color="C9B894"/>
+              <w:left w:val="single" w:sz="4" w:color="C9B894"/>
+              <w:bottom w:val="single" w:sz="4" w:color="C9B894"/>
+              <w:right w:val="single" w:sz="4" w:color="C9B894"/>
+            </w:tcBorders>
+          </w:tcPr>
+          <w:p>
+            <w:r>
+              <w:rPr>
+                <w:rFonts w:ascii="Georgia" w:hAnsi="Georgia"/>
+                <w:b w:val="0"/>
+                <w:i/>
+                <w:color w:val="705638"/>
+                <w:sz w:val="20"/>
+              </w:rPr>
+              <w:t>I</w:t>
+            </w:r>
+          </w:p>
+        </w:tc>
+        <w:tc>
+          <w:tcPr>
+            <w:tcW w:type="dxa" w:w="1440"/>
+            <w:tcBorders>
+              <w:top w:val="single" w:sz="4" w:color="C9B894"/>
+              <w:left w:val="single" w:sz="4" w:color="C9B894"/>
+              <w:bottom w:val="single" w:sz="4" w:color="C9B894"/>
+              <w:right w:val="single" w:sz="4" w:color="C9B894"/>
+            </w:tcBorders>
+            <w:shd w:val="clear" w:color="auto" w:fill="DCFCE7"/>
+          </w:tcPr>
+          <w:p>
+            <w:r>
+              <w:rPr>
+                <w:rFonts w:ascii="Georgia" w:hAnsi="Georgia"/>
+                <w:b/>
+                <w:i w:val="0"/>
+                <w:color w:val="15803D"/>
+                <w:sz w:val="20"/>
+              </w:rPr>
+              <w:t>Fix — Cross-language PRNG mismatch</w:t>
+            </w:r>
+          </w:p>
+        </w:tc>
+        <w:tc>
+          <w:tcPr>
+            <w:tcW w:type="dxa" w:w="6480"/>
+            <w:tcBorders>
+              <w:top w:val="single" w:sz="4" w:color="C9B894"/>
+              <w:left w:val="single" w:sz="4" w:color="C9B894"/>
+              <w:bottom w:val="single" w:sz="4" w:color="C9B894"/>
+              <w:right w:val="single" w:sz="4" w:color="C9B894"/>
+            </w:tcBorders>
+          </w:tcPr>
+          <w:p>
+            <w:r>
+              <w:rPr>
+                <w:rFonts w:ascii="Georgia" w:hAnsi="Georgia"/>
+                <w:b w:val="0"/>
+                <w:i w:val="0"/>
+                <w:color w:val="3B2F24"/>
+                <w:sz w:val="22"/>
+              </w:rPr>
+              <w:t>Cause: Mulberry32 had to match bit-for-bit in JS and Python including overflow semantics. Resolution: explicit &amp; 0xFFFFFFFF masks, head-to-head 10 000-sample comparison test before any artifacts were committed.</w:t>
+            </w:r>
+          </w:p>
+        </w:tc>
+      </w:tr>
+      <w:tr>
+        <w:tc>
+          <w:tcPr>
+            <w:tcW w:type="dxa" w:w="1296"/>
+            <w:tcBorders>
+              <w:top w:val="single" w:sz="4" w:color="C9B894"/>
+              <w:left w:val="single" w:sz="4" w:color="C9B894"/>
+              <w:bottom w:val="single" w:sz="4" w:color="C9B894"/>
+              <w:right w:val="single" w:sz="4" w:color="C9B894"/>
+            </w:tcBorders>
+          </w:tcPr>
+          <w:p>
+            <w:r>
+              <w:rPr>
+                <w:rFonts w:ascii="Georgia" w:hAnsi="Georgia"/>
+                <w:b w:val="0"/>
+                <w:i/>
+                <w:color w:val="705638"/>
+                <w:sz w:val="20"/>
+              </w:rPr>
+              <w:t>III</w:t>
+            </w:r>
+          </w:p>
+        </w:tc>
+        <w:tc>
+          <w:tcPr>
+            <w:tcW w:type="dxa" w:w="1440"/>
+            <w:tcBorders>
+              <w:top w:val="single" w:sz="4" w:color="C9B894"/>
+              <w:left w:val="single" w:sz="4" w:color="C9B894"/>
+              <w:bottom w:val="single" w:sz="4" w:color="C9B894"/>
+              <w:right w:val="single" w:sz="4" w:color="C9B894"/>
+            </w:tcBorders>
+            <w:shd w:val="clear" w:color="auto" w:fill="DCFCE7"/>
+          </w:tcPr>
+          <w:p>
+            <w:r>
+              <w:rPr>
+                <w:rFonts w:ascii="Georgia" w:hAnsi="Georgia"/>
+                <w:b/>
+                <w:i w:val="0"/>
+                <w:color w:val="15803D"/>
+                <w:sz w:val="20"/>
+              </w:rPr>
+              <w:t>Fix — Closed-form ignored actual storm</w:t>
+            </w:r>
+          </w:p>
+        </w:tc>
+        <w:tc>
+          <w:tcPr>
+            <w:tcW w:type="dxa" w:w="6480"/>
+            <w:tcBorders>
+              <w:top w:val="single" w:sz="4" w:color="C9B894"/>
+              <w:left w:val="single" w:sz="4" w:color="C9B894"/>
+              <w:bottom w:val="single" w:sz="4" w:color="C9B894"/>
+              <w:right w:val="single" w:sz="4" w:color="C9B894"/>
+            </w:tcBorders>
+          </w:tcPr>
+          <w:p>
+            <w:r>
+              <w:rPr>
+                <w:rFonts w:ascii="Georgia" w:hAnsi="Georgia"/>
+                <w:b w:val="0"/>
+                <w:i w:val="0"/>
+                <w:color w:val="3B2F24"/>
+                <w:sz w:val="22"/>
+              </w:rPr>
+              <w:t>Cause: read N from slider rather than realised storm. Resolution: read N from storm.outages.length when storm exists.</w:t>
+            </w:r>
+          </w:p>
+        </w:tc>
+      </w:tr>
+      <w:tr>
+        <w:tc>
+          <w:tcPr>
+            <w:tcW w:type="dxa" w:w="1296"/>
+            <w:tcBorders>
+              <w:top w:val="single" w:sz="4" w:color="C9B894"/>
+              <w:left w:val="single" w:sz="4" w:color="C9B894"/>
+              <w:bottom w:val="single" w:sz="4" w:color="C9B894"/>
+              <w:right w:val="single" w:sz="4" w:color="C9B894"/>
+            </w:tcBorders>
+          </w:tcPr>
+          <w:p>
+            <w:r>
+              <w:rPr>
+                <w:rFonts w:ascii="Georgia" w:hAnsi="Georgia"/>
+                <w:b w:val="0"/>
+                <w:i/>
+                <w:color w:val="705638"/>
+                <w:sz w:val="20"/>
+              </w:rPr>
+              <w:t>IV</w:t>
+            </w:r>
+          </w:p>
+        </w:tc>
+        <w:tc>
+          <w:tcPr>
+            <w:tcW w:type="dxa" w:w="1440"/>
+            <w:tcBorders>
+              <w:top w:val="single" w:sz="4" w:color="C9B894"/>
+              <w:left w:val="single" w:sz="4" w:color="C9B894"/>
+              <w:bottom w:val="single" w:sz="4" w:color="C9B894"/>
+              <w:right w:val="single" w:sz="4" w:color="C9B894"/>
+            </w:tcBorders>
+            <w:shd w:val="clear" w:color="auto" w:fill="DCFCE7"/>
+          </w:tcPr>
+          <w:p>
+            <w:r>
+              <w:rPr>
+                <w:rFonts w:ascii="Georgia" w:hAnsi="Georgia"/>
+                <w:b/>
+                <w:i w:val="0"/>
+                <w:color w:val="15803D"/>
+                <w:sz w:val="20"/>
+              </w:rPr>
+              <w:t>Fix — Dropdown invisible after deploy</w:t>
+            </w:r>
+          </w:p>
+        </w:tc>
+        <w:tc>
+          <w:tcPr>
+            <w:tcW w:type="dxa" w:w="6480"/>
+            <w:tcBorders>
+              <w:top w:val="single" w:sz="4" w:color="C9B894"/>
+              <w:left w:val="single" w:sz="4" w:color="C9B894"/>
+              <w:bottom w:val="single" w:sz="4" w:color="C9B894"/>
+              <w:right w:val="single" w:sz="4" w:color="C9B894"/>
+            </w:tcBorders>
+          </w:tcPr>
+          <w:p>
+            <w:r>
+              <w:rPr>
+                <w:rFonts w:ascii="Georgia" w:hAnsi="Georgia"/>
+                <w:b w:val="0"/>
+                <w:i w:val="0"/>
+                <w:color w:val="3B2F24"/>
+                <w:sz w:val="22"/>
+              </w:rPr>
+              <w:t>Cause: GitHub Pages deploy lag (2–10 min). Resolution: explained the deploy cycle + Ctrl+Shift+R hard refresh.</w:t>
+            </w:r>
+          </w:p>
+        </w:tc>
+      </w:tr>
+      <w:tr>
+        <w:tc>
+          <w:tcPr>
+            <w:tcW w:type="dxa" w:w="1296"/>
+            <w:tcBorders>
+              <w:top w:val="single" w:sz="4" w:color="C9B894"/>
+              <w:left w:val="single" w:sz="4" w:color="C9B894"/>
+              <w:bottom w:val="single" w:sz="4" w:color="C9B894"/>
+              <w:right w:val="single" w:sz="4" w:color="C9B894"/>
+            </w:tcBorders>
+          </w:tcPr>
+          <w:p>
+            <w:r>
+              <w:rPr>
+                <w:rFonts w:ascii="Georgia" w:hAnsi="Georgia"/>
+                <w:b w:val="0"/>
+                <w:i/>
+                <w:color w:val="705638"/>
+                <w:sz w:val="20"/>
+              </w:rPr>
+              <w:t>V</w:t>
+            </w:r>
+          </w:p>
+        </w:tc>
+        <w:tc>
+          <w:tcPr>
+            <w:tcW w:type="dxa" w:w="1440"/>
+            <w:tcBorders>
+              <w:top w:val="single" w:sz="4" w:color="C9B894"/>
+              <w:left w:val="single" w:sz="4" w:color="C9B894"/>
+              <w:bottom w:val="single" w:sz="4" w:color="C9B894"/>
+              <w:right w:val="single" w:sz="4" w:color="C9B894"/>
+            </w:tcBorders>
+            <w:shd w:val="clear" w:color="auto" w:fill="DCFCE7"/>
+          </w:tcPr>
+          <w:p>
+            <w:r>
+              <w:rPr>
+                <w:rFonts w:ascii="Georgia" w:hAnsi="Georgia"/>
+                <w:b/>
+                <w:i w:val="0"/>
+                <w:color w:val="15803D"/>
+                <w:sz w:val="20"/>
+              </w:rPr>
+              <w:t>Fix — MSVC linker missing</w:t>
+            </w:r>
+          </w:p>
+        </w:tc>
+        <w:tc>
+          <w:tcPr>
+            <w:tcW w:type="dxa" w:w="6480"/>
+            <w:tcBorders>
+              <w:top w:val="single" w:sz="4" w:color="C9B894"/>
+              <w:left w:val="single" w:sz="4" w:color="C9B894"/>
+              <w:bottom w:val="single" w:sz="4" w:color="C9B894"/>
+              <w:right w:val="single" w:sz="4" w:color="C9B894"/>
+            </w:tcBorders>
+          </w:tcPr>
+          <w:p>
+            <w:r>
+              <w:rPr>
+                <w:rFonts w:ascii="Georgia" w:hAnsi="Georgia"/>
+                <w:b w:val="0"/>
+                <w:i w:val="0"/>
+                <w:color w:val="3B2F24"/>
+                <w:sz w:val="22"/>
+              </w:rPr>
+              <w:t>Cause: Windows toolchain blocked Rust crates needing a host C linker. Resolution: #![no_std], crate-type cdylib, zero external deps, plain rustc.</w:t>
+            </w:r>
+          </w:p>
+        </w:tc>
+      </w:tr>
+      <w:tr>
+        <w:tc>
+          <w:tcPr>
+            <w:tcW w:type="dxa" w:w="1296"/>
+            <w:tcBorders>
+              <w:top w:val="single" w:sz="4" w:color="C9B894"/>
+              <w:left w:val="single" w:sz="4" w:color="C9B894"/>
+              <w:bottom w:val="single" w:sz="4" w:color="C9B894"/>
+              <w:right w:val="single" w:sz="4" w:color="C9B894"/>
+            </w:tcBorders>
+          </w:tcPr>
+          <w:p>
+            <w:r>
+              <w:rPr>
+                <w:rFonts w:ascii="Georgia" w:hAnsi="Georgia"/>
+                <w:b w:val="0"/>
+                <w:i/>
+                <w:color w:val="705638"/>
+                <w:sz w:val="20"/>
+              </w:rPr>
+              <w:t>V</w:t>
+            </w:r>
+          </w:p>
+        </w:tc>
+        <w:tc>
+          <w:tcPr>
+            <w:tcW w:type="dxa" w:w="1440"/>
+            <w:tcBorders>
+              <w:top w:val="single" w:sz="4" w:color="C9B894"/>
+              <w:left w:val="single" w:sz="4" w:color="C9B894"/>
+              <w:bottom w:val="single" w:sz="4" w:color="C9B894"/>
+              <w:right w:val="single" w:sz="4" w:color="C9B894"/>
+            </w:tcBorders>
+            <w:shd w:val="clear" w:color="auto" w:fill="DCFCE7"/>
+          </w:tcPr>
+          <w:p>
+            <w:r>
+              <w:rPr>
+                <w:rFonts w:ascii="Georgia" w:hAnsi="Georgia"/>
+                <w:b/>
+                <w:i w:val="0"/>
+                <w:color w:val="15803D"/>
+                <w:sz w:val="20"/>
+              </w:rPr>
+              <w:t>Fix — libm / wasm-bindgen blocked</w:t>
+            </w:r>
+          </w:p>
+        </w:tc>
+        <w:tc>
+          <w:tcPr>
+            <w:tcW w:type="dxa" w:w="6480"/>
+            <w:tcBorders>
+              <w:top w:val="single" w:sz="4" w:color="C9B894"/>
+              <w:left w:val="single" w:sz="4" w:color="C9B894"/>
+              <w:bottom w:val="single" w:sz="4" w:color="C9B894"/>
+              <w:right w:val="single" w:sz="4" w:color="C9B894"/>
+            </w:tcBorders>
+          </w:tcPr>
+          <w:p>
+            <w:r>
+              <w:rPr>
+                <w:rFonts w:ascii="Georgia" w:hAnsi="Georgia"/>
+                <w:b w:val="0"/>
+                <w:i w:val="0"/>
+                <w:color w:val="3B2F24"/>
+                <w:sz w:val="22"/>
+              </w:rPr>
+              <w:t>Cause: same root. Resolution: hand-rolled Taylor-series math (sin, cos, asin, sqrt, log, exp) inline; bump allocator; parallel-array heap. 17 KB compiled scheduler.wasm.</w:t>
+            </w:r>
+          </w:p>
+        </w:tc>
+      </w:tr>
+      <w:tr>
+        <w:tc>
+          <w:tcPr>
+            <w:tcW w:type="dxa" w:w="1296"/>
+            <w:tcBorders>
+              <w:top w:val="single" w:sz="4" w:color="C9B894"/>
+              <w:left w:val="single" w:sz="4" w:color="C9B894"/>
+              <w:bottom w:val="single" w:sz="4" w:color="C9B894"/>
+              <w:right w:val="single" w:sz="4" w:color="C9B894"/>
+            </w:tcBorders>
+          </w:tcPr>
+          <w:p>
+            <w:r>
+              <w:rPr>
+                <w:rFonts w:ascii="Georgia" w:hAnsi="Georgia"/>
+                <w:b w:val="0"/>
+                <w:i/>
+                <w:color w:val="705638"/>
+                <w:sz w:val="20"/>
+              </w:rPr>
+              <w:t>V</w:t>
+            </w:r>
+          </w:p>
+        </w:tc>
+        <w:tc>
+          <w:tcPr>
+            <w:tcW w:type="dxa" w:w="1440"/>
+            <w:tcBorders>
+              <w:top w:val="single" w:sz="4" w:color="C9B894"/>
+              <w:left w:val="single" w:sz="4" w:color="C9B894"/>
+              <w:bottom w:val="single" w:sz="4" w:color="C9B894"/>
+              <w:right w:val="single" w:sz="4" w:color="C9B894"/>
+            </w:tcBorders>
+            <w:shd w:val="clear" w:color="auto" w:fill="DCFCE7"/>
+          </w:tcPr>
+          <w:p>
+            <w:r>
+              <w:rPr>
+                <w:rFonts w:ascii="Georgia" w:hAnsi="Georgia"/>
+                <w:b/>
+                <w:i w:val="0"/>
+                <w:color w:val="15803D"/>
+                <w:sz w:val="20"/>
+              </w:rPr>
+              <w:t>Fix — WASM 2–3× slower than JS</w:t>
+            </w:r>
+          </w:p>
+        </w:tc>
+        <w:tc>
+          <w:tcPr>
+            <w:tcW w:type="dxa" w:w="6480"/>
+            <w:tcBorders>
+              <w:top w:val="single" w:sz="4" w:color="C9B894"/>
+              <w:left w:val="single" w:sz="4" w:color="C9B894"/>
+              <w:bottom w:val="single" w:sz="4" w:color="C9B894"/>
+              <w:right w:val="single" w:sz="4" w:color="C9B894"/>
+            </w:tcBorders>
+          </w:tcPr>
+          <w:p>
+            <w:r>
+              <w:rPr>
+                <w:rFonts w:ascii="Georgia" w:hAnsi="Georgia"/>
+                <w:b w:val="0"/>
+                <w:i w:val="0"/>
+                <w:color w:val="3B2F24"/>
+                <w:sz w:val="22"/>
+              </w:rPr>
+              <w:t>Cause: hand-rolled Taylor-series math vs V8's native Math.* intrinsics. Resolution: WASM kept as reference build; V8 JS remained the production scheduler.</w:t>
+            </w:r>
+          </w:p>
+        </w:tc>
+      </w:tr>
+      <w:tr>
+        <w:tc>
+          <w:tcPr>
+            <w:tcW w:type="dxa" w:w="1296"/>
+            <w:tcBorders>
+              <w:top w:val="single" w:sz="4" w:color="C9B894"/>
+              <w:left w:val="single" w:sz="4" w:color="C9B894"/>
+              <w:bottom w:val="single" w:sz="4" w:color="C9B894"/>
+              <w:right w:val="single" w:sz="4" w:color="C9B894"/>
+            </w:tcBorders>
+          </w:tcPr>
+          <w:p>
+            <w:r>
+              <w:rPr>
+                <w:rFonts w:ascii="Georgia" w:hAnsi="Georgia"/>
+                <w:b w:val="0"/>
+                <w:i/>
+                <w:color w:val="705638"/>
+                <w:sz w:val="20"/>
+              </w:rPr>
+              <w:t>VI</w:t>
+            </w:r>
+          </w:p>
+        </w:tc>
+        <w:tc>
+          <w:tcPr>
+            <w:tcW w:type="dxa" w:w="1440"/>
+            <w:tcBorders>
+              <w:top w:val="single" w:sz="4" w:color="C9B894"/>
+              <w:left w:val="single" w:sz="4" w:color="C9B894"/>
+              <w:bottom w:val="single" w:sz="4" w:color="C9B894"/>
+              <w:right w:val="single" w:sz="4" w:color="C9B894"/>
+            </w:tcBorders>
+            <w:shd w:val="clear" w:color="auto" w:fill="DCFCE7"/>
+          </w:tcPr>
+          <w:p>
+            <w:r>
+              <w:rPr>
+                <w:rFonts w:ascii="Georgia" w:hAnsi="Georgia"/>
+                <w:b/>
+                <w:i w:val="0"/>
+                <w:color w:val="15803D"/>
+                <w:sz w:val="20"/>
+              </w:rPr>
+              <w:t>Fix — "Failed to fetch" error</w:t>
+            </w:r>
+          </w:p>
+        </w:tc>
+        <w:tc>
+          <w:tcPr>
+            <w:tcW w:type="dxa" w:w="6480"/>
+            <w:tcBorders>
+              <w:top w:val="single" w:sz="4" w:color="C9B894"/>
+              <w:left w:val="single" w:sz="4" w:color="C9B894"/>
+              <w:bottom w:val="single" w:sz="4" w:color="C9B894"/>
+              <w:right w:val="single" w:sz="4" w:color="C9B894"/>
+            </w:tcBorders>
+          </w:tcPr>
+          <w:p>
+            <w:r>
+              <w:rPr>
+                <w:rFonts w:ascii="Georgia" w:hAnsi="Georgia"/>
+                <w:b w:val="0"/>
+                <w:i w:val="0"/>
+                <w:color w:val="3B2F24"/>
+                <w:sz w:val="22"/>
+              </w:rPr>
+              <w:t>Cause: FastAPI server is a separate process; toggling the UI doesn't start it. Resolution: pip install fastapi "uvicorn[standard]" pydantic + python -m uvicorn 07_server:app --port 8000.</w:t>
+            </w:r>
+          </w:p>
+        </w:tc>
+      </w:tr>
+      <w:tr>
+        <w:tc>
+          <w:tcPr>
+            <w:tcW w:type="dxa" w:w="1296"/>
+            <w:tcBorders>
+              <w:top w:val="single" w:sz="4" w:color="C9B894"/>
+              <w:left w:val="single" w:sz="4" w:color="C9B894"/>
+              <w:bottom w:val="single" w:sz="4" w:color="C9B894"/>
+              <w:right w:val="single" w:sz="4" w:color="C9B894"/>
+            </w:tcBorders>
+          </w:tcPr>
+          <w:p>
+            <w:r>
+              <w:rPr>
+                <w:rFonts w:ascii="Georgia" w:hAnsi="Georgia"/>
+                <w:b w:val="0"/>
+                <w:i/>
+                <w:color w:val="705638"/>
+                <w:sz w:val="20"/>
+              </w:rPr>
+              <w:t>VII</w:t>
+            </w:r>
+          </w:p>
+        </w:tc>
+        <w:tc>
+          <w:tcPr>
+            <w:tcW w:type="dxa" w:w="1440"/>
+            <w:tcBorders>
+              <w:top w:val="single" w:sz="4" w:color="C9B894"/>
+              <w:left w:val="single" w:sz="4" w:color="C9B894"/>
+              <w:bottom w:val="single" w:sz="4" w:color="C9B894"/>
+              <w:right w:val="single" w:sz="4" w:color="C9B894"/>
+            </w:tcBorders>
+            <w:shd w:val="clear" w:color="auto" w:fill="DCFCE7"/>
+          </w:tcPr>
+          <w:p>
+            <w:r>
+              <w:rPr>
+                <w:rFonts w:ascii="Georgia" w:hAnsi="Georgia"/>
+                <w:b/>
+                <w:i w:val="0"/>
+                <w:color w:val="15803D"/>
+                <w:sz w:val="20"/>
+              </w:rPr>
+              <w:t>Fix — Max-settings runs for minutes</w:t>
+            </w:r>
+          </w:p>
+        </w:tc>
+        <w:tc>
+          <w:tcPr>
+            <w:tcW w:type="dxa" w:w="6480"/>
+            <w:tcBorders>
+              <w:top w:val="single" w:sz="4" w:color="C9B894"/>
+              <w:left w:val="single" w:sz="4" w:color="C9B894"/>
+              <w:bottom w:val="single" w:sz="4" w:color="C9B894"/>
+              <w:right w:val="single" w:sz="4" w:color="C9B894"/>
+            </w:tcBorders>
+          </w:tcPr>
+          <w:p>
+            <w:r>
+              <w:rPr>
+                <w:rFonts w:ascii="Georgia" w:hAnsi="Georgia"/>
+                <w:b w:val="0"/>
+                <w:i w:val="0"/>
+                <w:color w:val="3B2F24"/>
+                <w:sz w:val="22"/>
+              </w:rPr>
+              <w:t>Cause: 25 k × 5 k = 625 M comparisons per Monte Carlo run × 30 seeds = 18 G ops in interpreted Python. Resolution (multi-step): NumPy vectorisation (+5×) → Numba JIT (+14×) → grid hash + n_available (+246×). Documented in Chapters VII &amp; VIII.</w:t>
+            </w:r>
+          </w:p>
+        </w:tc>
+      </w:tr>
+      <w:tr>
+        <w:tc>
+          <w:tcPr>
+            <w:tcW w:type="dxa" w:w="1296"/>
+            <w:tcBorders>
+              <w:top w:val="single" w:sz="4" w:color="C9B894"/>
+              <w:left w:val="single" w:sz="4" w:color="C9B894"/>
+              <w:bottom w:val="single" w:sz="4" w:color="C9B894"/>
+              <w:right w:val="single" w:sz="4" w:color="C9B894"/>
+            </w:tcBorders>
+          </w:tcPr>
+          <w:p>
+            <w:r>
+              <w:rPr>
+                <w:rFonts w:ascii="Georgia" w:hAnsi="Georgia"/>
+                <w:b w:val="0"/>
+                <w:i/>
+                <w:color w:val="705638"/>
+                <w:sz w:val="20"/>
+              </w:rPr>
+              <w:t>VII</w:t>
+            </w:r>
+          </w:p>
+        </w:tc>
+        <w:tc>
+          <w:tcPr>
+            <w:tcW w:type="dxa" w:w="1440"/>
+            <w:tcBorders>
+              <w:top w:val="single" w:sz="4" w:color="C9B894"/>
+              <w:left w:val="single" w:sz="4" w:color="C9B894"/>
+              <w:bottom w:val="single" w:sz="4" w:color="C9B894"/>
+              <w:right w:val="single" w:sz="4" w:color="C9B894"/>
+            </w:tcBorders>
+            <w:shd w:val="clear" w:color="auto" w:fill="DCFCE7"/>
+          </w:tcPr>
+          <w:p>
+            <w:r>
+              <w:rPr>
+                <w:rFonts w:ascii="Georgia" w:hAnsi="Georgia"/>
+                <w:b/>
+                <w:i w:val="0"/>
+                <w:color w:val="15803D"/>
+                <w:sz w:val="20"/>
+              </w:rPr>
+              <w:t>Fix — KD-tree slower than expected</w:t>
+            </w:r>
+          </w:p>
+        </w:tc>
+        <w:tc>
+          <w:tcPr>
+            <w:tcW w:type="dxa" w:w="6480"/>
+            <w:tcBorders>
+              <w:top w:val="single" w:sz="4" w:color="C9B894"/>
+              <w:left w:val="single" w:sz="4" w:color="C9B894"/>
+              <w:bottom w:val="single" w:sz="4" w:color="C9B894"/>
+              <w:right w:val="single" w:sz="4" w:color="C9B894"/>
+            </w:tcBorders>
+          </w:tcPr>
+          <w:p>
+            <w:r>
+              <w:rPr>
+                <w:rFonts w:ascii="Georgia" w:hAnsi="Georgia"/>
+                <w:b w:val="0"/>
+                <w:i w:val="0"/>
+                <w:color w:val="3B2F24"/>
+                <w:sz w:val="22"/>
+              </w:rPr>
+              <w:t>Cause: in realistic mode only ~30% of outages are discovered early; K balloons as filtered results shrink. Resolution: K_CAP = 256 with fallback to vectorised scan. Useful only in non-realistic dense regimes.</w:t>
+            </w:r>
+          </w:p>
+        </w:tc>
+      </w:tr>
+      <w:tr>
+        <w:tc>
+          <w:tcPr>
+            <w:tcW w:type="dxa" w:w="1296"/>
+            <w:tcBorders>
+              <w:top w:val="single" w:sz="4" w:color="C9B894"/>
+              <w:left w:val="single" w:sz="4" w:color="C9B894"/>
+              <w:bottom w:val="single" w:sz="4" w:color="C9B894"/>
+              <w:right w:val="single" w:sz="4" w:color="C9B894"/>
+            </w:tcBorders>
+          </w:tcPr>
+          <w:p>
+            <w:r>
+              <w:rPr>
+                <w:rFonts w:ascii="Georgia" w:hAnsi="Georgia"/>
+                <w:b w:val="0"/>
+                <w:i/>
+                <w:color w:val="705638"/>
+                <w:sz w:val="20"/>
+              </w:rPr>
+              <w:t>VII</w:t>
+            </w:r>
+          </w:p>
+        </w:tc>
+        <w:tc>
+          <w:tcPr>
+            <w:tcW w:type="dxa" w:w="1440"/>
+            <w:tcBorders>
+              <w:top w:val="single" w:sz="4" w:color="C9B894"/>
+              <w:left w:val="single" w:sz="4" w:color="C9B894"/>
+              <w:bottom w:val="single" w:sz="4" w:color="C9B894"/>
+              <w:right w:val="single" w:sz="4" w:color="C9B894"/>
+            </w:tcBorders>
+            <w:shd w:val="clear" w:color="auto" w:fill="DCFCE7"/>
+          </w:tcPr>
+          <w:p>
+            <w:r>
+              <w:rPr>
+                <w:rFonts w:ascii="Georgia" w:hAnsi="Georgia"/>
+                <w:b/>
+                <w:i w:val="0"/>
+                <w:color w:val="15803D"/>
+                <w:sz w:val="20"/>
+              </w:rPr>
+              <w:t>Fix — Monte Carlo stddev = 0</w:t>
+            </w:r>
+          </w:p>
+        </w:tc>
+        <w:tc>
+          <w:tcPr>
+            <w:tcW w:type="dxa" w:w="6480"/>
+            <w:tcBorders>
+              <w:top w:val="single" w:sz="4" w:color="C9B894"/>
+              <w:left w:val="single" w:sz="4" w:color="C9B894"/>
+              <w:bottom w:val="single" w:sz="4" w:color="C9B894"/>
+              <w:right w:val="single" w:sz="4" w:color="C9B894"/>
+            </w:tcBorders>
+          </w:tcPr>
+          <w:p>
+            <w:r>
+              <w:rPr>
+                <w:rFonts w:ascii="Georgia" w:hAnsi="Georgia"/>
+                <w:b w:val="0"/>
+                <w:i w:val="0"/>
+                <w:color w:val="3B2F24"/>
+                <w:sz w:val="22"/>
+              </w:rPr>
+              <w:t>Cause: RNG seeds inside the scheduler were hardcoded constants, so all 30 "different" runs were identical. Resolution: per-seed RNG streams (seed * 1117 + 23 for repair, seed * 991 + 7 for discovery).</w:t>
+            </w:r>
+          </w:p>
+        </w:tc>
+      </w:tr>
+      <w:tr>
+        <w:tc>
+          <w:tcPr>
+            <w:tcW w:type="dxa" w:w="1296"/>
+            <w:tcBorders>
+              <w:top w:val="single" w:sz="4" w:color="C9B894"/>
+              <w:left w:val="single" w:sz="4" w:color="C9B894"/>
+              <w:bottom w:val="single" w:sz="4" w:color="C9B894"/>
+              <w:right w:val="single" w:sz="4" w:color="C9B894"/>
+            </w:tcBorders>
+          </w:tcPr>
+          <w:p>
+            <w:r>
+              <w:rPr>
+                <w:rFonts w:ascii="Georgia" w:hAnsi="Georgia"/>
+                <w:b w:val="0"/>
+                <w:i/>
+                <w:color w:val="705638"/>
+                <w:sz w:val="20"/>
+              </w:rPr>
+              <w:t>VII</w:t>
+            </w:r>
+          </w:p>
+        </w:tc>
+        <w:tc>
+          <w:tcPr>
+            <w:tcW w:type="dxa" w:w="1440"/>
+            <w:tcBorders>
+              <w:top w:val="single" w:sz="4" w:color="C9B894"/>
+              <w:left w:val="single" w:sz="4" w:color="C9B894"/>
+              <w:bottom w:val="single" w:sz="4" w:color="C9B894"/>
+              <w:right w:val="single" w:sz="4" w:color="C9B894"/>
+            </w:tcBorders>
+            <w:shd w:val="clear" w:color="auto" w:fill="DCFCE7"/>
+          </w:tcPr>
+          <w:p>
+            <w:r>
+              <w:rPr>
+                <w:rFonts w:ascii="Georgia" w:hAnsi="Georgia"/>
+                <w:b/>
+                <w:i w:val="0"/>
+                <w:color w:val="15803D"/>
+                <w:sz w:val="20"/>
+              </w:rPr>
+              <w:t>Fix — Process pool slower than serial</w:t>
+            </w:r>
+          </w:p>
+        </w:tc>
+        <w:tc>
+          <w:tcPr>
+            <w:tcW w:type="dxa" w:w="6480"/>
+            <w:tcBorders>
+              <w:top w:val="single" w:sz="4" w:color="C9B894"/>
+              <w:left w:val="single" w:sz="4" w:color="C9B894"/>
+              <w:bottom w:val="single" w:sz="4" w:color="C9B894"/>
+              <w:right w:val="single" w:sz="4" w:color="C9B894"/>
+            </w:tcBorders>
+          </w:tcPr>
+          <w:p>
+            <w:r>
+              <w:rPr>
+                <w:rFonts w:ascii="Georgia" w:hAnsi="Georgia"/>
+                <w:b w:val="0"/>
+                <w:i w:val="0"/>
+                <w:color w:val="3B2F24"/>
+                <w:sz w:val="22"/>
+              </w:rPr>
+              <w:t>Cause: Windows process-spawn overhead (~1 s/worker) + per-worker Numba cache load on cold subprocess. Resolution: heuristic threshold — only use pool when N × crews &gt; 10M.</w:t>
+            </w:r>
+          </w:p>
+        </w:tc>
+      </w:tr>
+      <w:tr>
+        <w:tc>
+          <w:tcPr>
+            <w:tcW w:type="dxa" w:w="1296"/>
+            <w:tcBorders>
+              <w:top w:val="single" w:sz="4" w:color="C9B894"/>
+              <w:left w:val="single" w:sz="4" w:color="C9B894"/>
+              <w:bottom w:val="single" w:sz="4" w:color="C9B894"/>
+              <w:right w:val="single" w:sz="4" w:color="C9B894"/>
+            </w:tcBorders>
+          </w:tcPr>
+          <w:p>
+            <w:r>
+              <w:rPr>
+                <w:rFonts w:ascii="Georgia" w:hAnsi="Georgia"/>
+                <w:b w:val="0"/>
+                <w:i/>
+                <w:color w:val="705638"/>
+                <w:sz w:val="20"/>
+              </w:rPr>
+              <w:t>VIII</w:t>
+            </w:r>
+          </w:p>
+        </w:tc>
+        <w:tc>
+          <w:tcPr>
+            <w:tcW w:type="dxa" w:w="1440"/>
+            <w:tcBorders>
+              <w:top w:val="single" w:sz="4" w:color="C9B894"/>
+              <w:left w:val="single" w:sz="4" w:color="C9B894"/>
+              <w:bottom w:val="single" w:sz="4" w:color="C9B894"/>
+              <w:right w:val="single" w:sz="4" w:color="C9B894"/>
+            </w:tcBorders>
+            <w:shd w:val="clear" w:color="auto" w:fill="DCFCE7"/>
+          </w:tcPr>
+          <w:p>
+            <w:r>
+              <w:rPr>
+                <w:rFonts w:ascii="Georgia" w:hAnsi="Georgia"/>
+                <w:b/>
+                <w:i w:val="0"/>
+                <w:color w:val="15803D"/>
+                <w:sz w:val="20"/>
+              </w:rPr>
+              <w:t>Fix — Grid hash slower than flat scan</w:t>
+            </w:r>
+          </w:p>
+        </w:tc>
+        <w:tc>
+          <w:tcPr>
+            <w:tcW w:type="dxa" w:w="6480"/>
+            <w:tcBorders>
+              <w:top w:val="single" w:sz="4" w:color="C9B894"/>
+              <w:left w:val="single" w:sz="4" w:color="C9B894"/>
+              <w:bottom w:val="single" w:sz="4" w:color="C9B894"/>
+              <w:right w:val="single" w:sz="4" w:color="C9B894"/>
+            </w:tcBorders>
+          </w:tcPr>
+          <w:p>
+            <w:r>
+              <w:rPr>
+                <w:rFonts w:ascii="Georgia" w:hAnsi="Georgia"/>
+                <w:b w:val="0"/>
+                <w:i w:val="0"/>
+                <w:color w:val="3B2F24"/>
+                <w:sz w:val="22"/>
+              </w:rPr>
+              <w:t>Cause: "skip non-boundary cells" optimisation revisited interior cells when the search box clamped to the grid edge. Resolution: rewrote ring iteration to enumerate Chebyshev-distance == ring boundary cells directly.</w:t>
+            </w:r>
+          </w:p>
+        </w:tc>
+      </w:tr>
+      <w:tr>
+        <w:tc>
+          <w:tcPr>
+            <w:tcW w:type="dxa" w:w="1296"/>
+            <w:tcBorders>
+              <w:top w:val="single" w:sz="4" w:color="C9B894"/>
+              <w:left w:val="single" w:sz="4" w:color="C9B894"/>
+              <w:bottom w:val="single" w:sz="4" w:color="C9B894"/>
+              <w:right w:val="single" w:sz="4" w:color="C9B894"/>
+            </w:tcBorders>
+          </w:tcPr>
+          <w:p>
+            <w:r>
+              <w:rPr>
+                <w:rFonts w:ascii="Georgia" w:hAnsi="Georgia"/>
+                <w:b w:val="0"/>
+                <w:i/>
+                <w:color w:val="705638"/>
+                <w:sz w:val="20"/>
+              </w:rPr>
+              <w:t>VIII</w:t>
+            </w:r>
+          </w:p>
+        </w:tc>
+        <w:tc>
+          <w:tcPr>
+            <w:tcW w:type="dxa" w:w="1440"/>
+            <w:tcBorders>
+              <w:top w:val="single" w:sz="4" w:color="C9B894"/>
+              <w:left w:val="single" w:sz="4" w:color="C9B894"/>
+              <w:bottom w:val="single" w:sz="4" w:color="C9B894"/>
+              <w:right w:val="single" w:sz="4" w:color="C9B894"/>
+            </w:tcBorders>
+            <w:shd w:val="clear" w:color="auto" w:fill="DCFCE7"/>
+          </w:tcPr>
+          <w:p>
+            <w:r>
+              <w:rPr>
+                <w:rFonts w:ascii="Georgia" w:hAnsi="Georgia"/>
+                <w:b/>
+                <w:i w:val="0"/>
+                <w:color w:val="15803D"/>
+                <w:sz w:val="20"/>
+              </w:rPr>
+              <w:t>Fix — Discovery thrashing at high crew counts</w:t>
+            </w:r>
+          </w:p>
+        </w:tc>
+        <w:tc>
+          <w:tcPr>
+            <w:tcW w:type="dxa" w:w="6480"/>
+            <w:tcBorders>
+              <w:top w:val="single" w:sz="4" w:color="C9B894"/>
+              <w:left w:val="single" w:sz="4" w:color="C9B894"/>
+              <w:bottom w:val="single" w:sz="4" w:color="C9B894"/>
+              <w:right w:val="single" w:sz="4" w:color="C9B894"/>
+            </w:tcBorders>
+          </w:tcPr>
+          <w:p>
+            <w:r>
+              <w:rPr>
+                <w:rFonts w:ascii="Georgia" w:hAnsi="Georgia"/>
+                <w:b w:val="0"/>
+                <w:i w:val="0"/>
+                <w:color w:val="3B2F24"/>
+                <w:sz w:val="22"/>
+              </w:rPr>
+              <w:t>Cause: 5 000 crews all awake at t=12 h while only a tiny fraction of outages were discovered; each crew walked the full grid finding nothing. Resolution: incrementally maintained n_available counter — fast-forward immediately when zero via np.searchsorted. Single biggest commit win of the project (118 s → 0.48 s).</w:t>
+            </w:r>
+          </w:p>
+        </w:tc>
+      </w:tr>
+      <w:tr>
+        <w:tc>
+          <w:tcPr>
+            <w:tcW w:type="dxa" w:w="1296"/>
+            <w:tcBorders>
+              <w:top w:val="single" w:sz="4" w:color="C9B894"/>
+              <w:left w:val="single" w:sz="4" w:color="C9B894"/>
+              <w:bottom w:val="single" w:sz="4" w:color="C9B894"/>
+              <w:right w:val="single" w:sz="4" w:color="C9B894"/>
+            </w:tcBorders>
+          </w:tcPr>
+          <w:p>
+            <w:r>
+              <w:rPr>
+                <w:rFonts w:ascii="Georgia" w:hAnsi="Georgia"/>
+                <w:b w:val="0"/>
+                <w:i/>
+                <w:color w:val="705638"/>
+                <w:sz w:val="20"/>
+              </w:rPr>
+              <w:t>IX</w:t>
+            </w:r>
+          </w:p>
+        </w:tc>
+        <w:tc>
+          <w:tcPr>
+            <w:tcW w:type="dxa" w:w="1440"/>
+            <w:tcBorders>
+              <w:top w:val="single" w:sz="4" w:color="C9B894"/>
+              <w:left w:val="single" w:sz="4" w:color="C9B894"/>
+              <w:bottom w:val="single" w:sz="4" w:color="C9B894"/>
+              <w:right w:val="single" w:sz="4" w:color="C9B894"/>
+            </w:tcBorders>
+            <w:shd w:val="clear" w:color="auto" w:fill="DCFCE7"/>
+          </w:tcPr>
+          <w:p>
+            <w:r>
+              <w:rPr>
+                <w:rFonts w:ascii="Georgia" w:hAnsi="Georgia"/>
+                <w:b/>
+                <w:i w:val="0"/>
+                <w:color w:val="15803D"/>
+                <w:sz w:val="20"/>
+              </w:rPr>
+              <w:t>Fix — Render deploy #1: matplotlib missing</w:t>
+            </w:r>
+          </w:p>
+        </w:tc>
+        <w:tc>
+          <w:tcPr>
+            <w:tcW w:type="dxa" w:w="6480"/>
+            <w:tcBorders>
+              <w:top w:val="single" w:sz="4" w:color="C9B894"/>
+              <w:left w:val="single" w:sz="4" w:color="C9B894"/>
+              <w:bottom w:val="single" w:sz="4" w:color="C9B894"/>
+              <w:right w:val="single" w:sz="4" w:color="C9B894"/>
+            </w:tcBorders>
+          </w:tcPr>
+          <w:p>
+            <w:r>
+              <w:rPr>
+                <w:rFonts w:ascii="Georgia" w:hAnsi="Georgia"/>
+                <w:b w:val="0"/>
+                <w:i w:val="0"/>
+                <w:color w:val="3B2F24"/>
+                <w:sz w:val="22"/>
+              </w:rPr>
+              <w:t>Cause: 05_generate_artifacts.py imports matplotlib unconditionally; server imported it via importlib. Resolution (interim): added matplotlib to Docker image.</w:t>
+            </w:r>
+          </w:p>
+        </w:tc>
+      </w:tr>
+      <w:tr>
+        <w:tc>
+          <w:tcPr>
+            <w:tcW w:type="dxa" w:w="1296"/>
+            <w:tcBorders>
+              <w:top w:val="single" w:sz="4" w:color="C9B894"/>
+              <w:left w:val="single" w:sz="4" w:color="C9B894"/>
+              <w:bottom w:val="single" w:sz="4" w:color="C9B894"/>
+              <w:right w:val="single" w:sz="4" w:color="C9B894"/>
+            </w:tcBorders>
+          </w:tcPr>
+          <w:p>
+            <w:r>
+              <w:rPr>
+                <w:rFonts w:ascii="Georgia" w:hAnsi="Georgia"/>
+                <w:b w:val="0"/>
+                <w:i/>
+                <w:color w:val="705638"/>
+                <w:sz w:val="20"/>
+              </w:rPr>
+              <w:t>IX</w:t>
+            </w:r>
+          </w:p>
+        </w:tc>
+        <w:tc>
+          <w:tcPr>
+            <w:tcW w:type="dxa" w:w="1440"/>
+            <w:tcBorders>
+              <w:top w:val="single" w:sz="4" w:color="C9B894"/>
+              <w:left w:val="single" w:sz="4" w:color="C9B894"/>
+              <w:bottom w:val="single" w:sz="4" w:color="C9B894"/>
+              <w:right w:val="single" w:sz="4" w:color="C9B894"/>
+            </w:tcBorders>
+            <w:shd w:val="clear" w:color="auto" w:fill="DCFCE7"/>
+          </w:tcPr>
+          <w:p>
+            <w:r>
+              <w:rPr>
+                <w:rFonts w:ascii="Georgia" w:hAnsi="Georgia"/>
+                <w:b/>
+                <w:i w:val="0"/>
+                <w:color w:val="15803D"/>
+                <w:sz w:val="20"/>
+              </w:rPr>
+              <w:t>Fix — Render deploy #2: FileNotFoundError</w:t>
+            </w:r>
+          </w:p>
+        </w:tc>
+        <w:tc>
+          <w:tcPr>
+            <w:tcW w:type="dxa" w:w="6480"/>
+            <w:tcBorders>
+              <w:top w:val="single" w:sz="4" w:color="C9B894"/>
+              <w:left w:val="single" w:sz="4" w:color="C9B894"/>
+              <w:bottom w:val="single" w:sz="4" w:color="C9B894"/>
+              <w:right w:val="single" w:sz="4" w:color="C9B894"/>
+            </w:tcBorders>
+          </w:tcPr>
+          <w:p>
+            <w:r>
+              <w:rPr>
+                <w:rFonts w:ascii="Georgia" w:hAnsi="Georgia"/>
+                <w:b w:val="0"/>
+                <w:i w:val="0"/>
+                <w:color w:val="3B2F24"/>
+                <w:sz w:val="22"/>
+              </w:rPr>
+              <w:t>Cause: same file loads data/hartford_boundary.json at module level; not shipped in image. Resolution (interim): wrapped import in try/except Exception.</w:t>
+            </w:r>
+          </w:p>
+        </w:tc>
+      </w:tr>
+      <w:tr>
+        <w:tc>
+          <w:tcPr>
+            <w:tcW w:type="dxa" w:w="1296"/>
+            <w:tcBorders>
+              <w:top w:val="single" w:sz="4" w:color="C9B894"/>
+              <w:left w:val="single" w:sz="4" w:color="C9B894"/>
+              <w:bottom w:val="single" w:sz="4" w:color="C9B894"/>
+              <w:right w:val="single" w:sz="4" w:color="C9B894"/>
+            </w:tcBorders>
+          </w:tcPr>
+          <w:p>
+            <w:r>
+              <w:rPr>
+                <w:rFonts w:ascii="Georgia" w:hAnsi="Georgia"/>
+                <w:b w:val="0"/>
+                <w:i/>
+                <w:color w:val="705638"/>
+                <w:sz w:val="20"/>
+              </w:rPr>
+              <w:t>IX</w:t>
+            </w:r>
+          </w:p>
+        </w:tc>
+        <w:tc>
+          <w:tcPr>
+            <w:tcW w:type="dxa" w:w="1440"/>
+            <w:tcBorders>
+              <w:top w:val="single" w:sz="4" w:color="C9B894"/>
+              <w:left w:val="single" w:sz="4" w:color="C9B894"/>
+              <w:bottom w:val="single" w:sz="4" w:color="C9B894"/>
+              <w:right w:val="single" w:sz="4" w:color="C9B894"/>
+            </w:tcBorders>
+            <w:shd w:val="clear" w:color="auto" w:fill="DCFCE7"/>
+          </w:tcPr>
+          <w:p>
+            <w:r>
+              <w:rPr>
+                <w:rFonts w:ascii="Georgia" w:hAnsi="Georgia"/>
+                <w:b/>
+                <w:i w:val="0"/>
+                <w:color w:val="15803D"/>
+                <w:sz w:val="20"/>
+              </w:rPr>
+              <w:t>Fix — Render deploy #3: SAME error after try/except</w:t>
+            </w:r>
+          </w:p>
+        </w:tc>
+        <w:tc>
+          <w:tcPr>
+            <w:tcW w:type="dxa" w:w="6480"/>
+            <w:tcBorders>
+              <w:top w:val="single" w:sz="4" w:color="C9B894"/>
+              <w:left w:val="single" w:sz="4" w:color="C9B894"/>
+              <w:bottom w:val="single" w:sz="4" w:color="C9B894"/>
+              <w:right w:val="single" w:sz="4" w:color="C9B894"/>
+            </w:tcBorders>
+          </w:tcPr>
+          <w:p>
+            <w:r>
+              <w:rPr>
+                <w:rFonts w:ascii="Georgia" w:hAnsi="Georgia"/>
+                <w:b w:val="0"/>
+                <w:i w:val="0"/>
+                <w:color w:val="3B2F24"/>
+                <w:sz w:val="22"/>
+              </w:rPr>
+              <w:t>Cause: file raises SystemExit, which inherits from BaseException, not Exception. except Exception deliberately doesn't catch sys.exit() — standard library design. Resolution (real): stop importing 05_generate_artifacts entirely; Numba/NumPy schedulers cover the same functionality faster.</w:t>
+            </w:r>
+          </w:p>
+        </w:tc>
+      </w:tr>
+      <w:tr>
+        <w:tc>
+          <w:tcPr>
+            <w:tcW w:type="dxa" w:w="1296"/>
+            <w:tcBorders>
+              <w:top w:val="single" w:sz="4" w:color="C9B894"/>
+              <w:left w:val="single" w:sz="4" w:color="C9B894"/>
+              <w:bottom w:val="single" w:sz="4" w:color="C9B894"/>
+              <w:right w:val="single" w:sz="4" w:color="C9B894"/>
+            </w:tcBorders>
+          </w:tcPr>
+          <w:p>
+            <w:r>
+              <w:rPr>
+                <w:rFonts w:ascii="Georgia" w:hAnsi="Georgia"/>
+                <w:b w:val="0"/>
+                <w:i/>
+                <w:color w:val="705638"/>
+                <w:sz w:val="20"/>
+              </w:rPr>
+              <w:t>X</w:t>
+            </w:r>
+          </w:p>
+        </w:tc>
+        <w:tc>
+          <w:tcPr>
+            <w:tcW w:type="dxa" w:w="1440"/>
+            <w:tcBorders>
+              <w:top w:val="single" w:sz="4" w:color="C9B894"/>
+              <w:left w:val="single" w:sz="4" w:color="C9B894"/>
+              <w:bottom w:val="single" w:sz="4" w:color="C9B894"/>
+              <w:right w:val="single" w:sz="4" w:color="C9B894"/>
+            </w:tcBorders>
+            <w:shd w:val="clear" w:color="auto" w:fill="DCFCE7"/>
+          </w:tcPr>
+          <w:p>
+            <w:r>
+              <w:rPr>
+                <w:rFonts w:ascii="Georgia" w:hAnsi="Georgia"/>
+                <w:b/>
+                <w:i w:val="0"/>
+                <w:color w:val="15803D"/>
+                <w:sz w:val="20"/>
+              </w:rPr>
+              <w:t>Fix — User pasted Service ID, not URL</w:t>
+            </w:r>
+          </w:p>
+        </w:tc>
+        <w:tc>
+          <w:tcPr>
+            <w:tcW w:type="dxa" w:w="6480"/>
+            <w:tcBorders>
+              <w:top w:val="single" w:sz="4" w:color="C9B894"/>
+              <w:left w:val="single" w:sz="4" w:color="C9B894"/>
+              <w:bottom w:val="single" w:sz="4" w:color="C9B894"/>
+              <w:right w:val="single" w:sz="4" w:color="C9B894"/>
+            </w:tcBorders>
+          </w:tcPr>
+          <w:p>
+            <w:r>
+              <w:rPr>
+                <w:rFonts w:ascii="Georgia" w:hAnsi="Georgia"/>
+                <w:b w:val="0"/>
+                <w:i w:val="0"/>
+                <w:color w:val="3B2F24"/>
+                <w:sz w:val="22"/>
+              </w:rPr>
+              <w:t>Cause: Render dashboard label looked URL-like (srv-d8qs8b6gvqtc73e70mog). Resolution: clearer panel labelling + default the field to the deployed URL.</w:t>
+            </w:r>
+          </w:p>
+        </w:tc>
+      </w:tr>
+      <w:tr>
+        <w:tc>
+          <w:tcPr>
+            <w:tcW w:type="dxa" w:w="1296"/>
+            <w:tcBorders>
+              <w:top w:val="single" w:sz="4" w:color="C9B894"/>
+              <w:left w:val="single" w:sz="4" w:color="C9B894"/>
+              <w:bottom w:val="single" w:sz="4" w:color="C9B894"/>
+              <w:right w:val="single" w:sz="4" w:color="C9B894"/>
+            </w:tcBorders>
+          </w:tcPr>
+          <w:p>
+            <w:r>
+              <w:rPr>
+                <w:rFonts w:ascii="Georgia" w:hAnsi="Georgia"/>
+                <w:b w:val="0"/>
+                <w:i/>
+                <w:color w:val="705638"/>
+                <w:sz w:val="20"/>
+              </w:rPr>
+              <w:t>X</w:t>
+            </w:r>
+          </w:p>
+        </w:tc>
+        <w:tc>
+          <w:tcPr>
+            <w:tcW w:type="dxa" w:w="1440"/>
+            <w:tcBorders>
+              <w:top w:val="single" w:sz="4" w:color="C9B894"/>
+              <w:left w:val="single" w:sz="4" w:color="C9B894"/>
+              <w:bottom w:val="single" w:sz="4" w:color="C9B894"/>
+              <w:right w:val="single" w:sz="4" w:color="C9B894"/>
+            </w:tcBorders>
+            <w:shd w:val="clear" w:color="auto" w:fill="DCFCE7"/>
+          </w:tcPr>
+          <w:p>
+            <w:r>
+              <w:rPr>
+                <w:rFonts w:ascii="Georgia" w:hAnsi="Georgia"/>
+                <w:b/>
+                <w:i w:val="0"/>
+                <w:color w:val="15803D"/>
+                <w:sz w:val="20"/>
+              </w:rPr>
+              <w:t>Fix — Render cold-start splash confused user</w:t>
+            </w:r>
+          </w:p>
+        </w:tc>
+        <w:tc>
+          <w:tcPr>
+            <w:tcW w:type="dxa" w:w="6480"/>
+            <w:tcBorders>
+              <w:top w:val="single" w:sz="4" w:color="C9B894"/>
+              <w:left w:val="single" w:sz="4" w:color="C9B894"/>
+              <w:bottom w:val="single" w:sz="4" w:color="C9B894"/>
+              <w:right w:val="single" w:sz="4" w:color="C9B894"/>
+            </w:tcBorders>
+          </w:tcPr>
+          <w:p>
+            <w:r>
+              <w:rPr>
+                <w:rFonts w:ascii="Georgia" w:hAnsi="Georgia"/>
+                <w:b w:val="0"/>
+                <w:i w:val="0"/>
+                <w:color w:val="3B2F24"/>
+                <w:sz w:val="22"/>
+              </w:rPr>
+              <w:t>Cause: free-tier containers sleep after 15 min idle; next request triggers a 30–60 s wake-up shown as a splash. Resolution: warm-up ping fires on page load; health dot turns green when ready; fake exponential progress bar so the wait feels active.</w:t>
+            </w:r>
+          </w:p>
+        </w:tc>
+      </w:tr>
+      <w:tr>
+        <w:tc>
+          <w:tcPr>
+            <w:tcW w:type="dxa" w:w="1296"/>
+            <w:tcBorders>
+              <w:top w:val="single" w:sz="4" w:color="C9B894"/>
+              <w:left w:val="single" w:sz="4" w:color="C9B894"/>
+              <w:bottom w:val="single" w:sz="4" w:color="C9B894"/>
+              <w:right w:val="single" w:sz="4" w:color="C9B894"/>
+            </w:tcBorders>
+          </w:tcPr>
+          <w:p>
+            <w:r>
+              <w:rPr>
+                <w:rFonts w:ascii="Georgia" w:hAnsi="Georgia"/>
+                <w:b w:val="0"/>
+                <w:i/>
+                <w:color w:val="705638"/>
+                <w:sz w:val="20"/>
+              </w:rPr>
+              <w:t>X</w:t>
+            </w:r>
+          </w:p>
+        </w:tc>
+        <w:tc>
+          <w:tcPr>
+            <w:tcW w:type="dxa" w:w="1440"/>
+            <w:tcBorders>
+              <w:top w:val="single" w:sz="4" w:color="C9B894"/>
+              <w:left w:val="single" w:sz="4" w:color="C9B894"/>
+              <w:bottom w:val="single" w:sz="4" w:color="C9B894"/>
+              <w:right w:val="single" w:sz="4" w:color="C9B894"/>
+            </w:tcBorders>
+            <w:shd w:val="clear" w:color="auto" w:fill="DCFCE7"/>
+          </w:tcPr>
+          <w:p>
+            <w:r>
+              <w:rPr>
+                <w:rFonts w:ascii="Georgia" w:hAnsi="Georgia"/>
+                <w:b/>
+                <w:i w:val="0"/>
+                <w:color w:val="15803D"/>
+                <w:sz w:val="20"/>
+              </w:rPr>
+              <w:t>Fix — No way to verify deployed commit</w:t>
+            </w:r>
+          </w:p>
+        </w:tc>
+        <w:tc>
+          <w:tcPr>
+            <w:tcW w:type="dxa" w:w="6480"/>
+            <w:tcBorders>
+              <w:top w:val="single" w:sz="4" w:color="C9B894"/>
+              <w:left w:val="single" w:sz="4" w:color="C9B894"/>
+              <w:bottom w:val="single" w:sz="4" w:color="C9B894"/>
+              <w:right w:val="single" w:sz="4" w:color="C9B894"/>
+            </w:tcBorders>
+          </w:tcPr>
+          <w:p>
+            <w:r>
+              <w:rPr>
+                <w:rFonts w:ascii="Georgia" w:hAnsi="Georgia"/>
+                <w:b w:val="0"/>
+                <w:i w:val="0"/>
+                <w:color w:val="3B2F24"/>
+                <w:sz w:val="22"/>
+              </w:rPr>
+              <w:t>Cause: no version endpoint. Resolution: added GET /version returning {"commit": "...", "backend": "..."}; frontend displays the SHA so it can be matched against GitHub HEAD.</w:t>
+            </w:r>
+          </w:p>
+        </w:tc>
+      </w:tr>
+      <w:tr>
+        <w:tc>
+          <w:tcPr>
+            <w:tcW w:type="dxa" w:w="1296"/>
+            <w:tcBorders>
+              <w:top w:val="single" w:sz="4" w:color="C9B894"/>
+              <w:left w:val="single" w:sz="4" w:color="C9B894"/>
+              <w:bottom w:val="single" w:sz="4" w:color="C9B894"/>
+              <w:right w:val="single" w:sz="4" w:color="C9B894"/>
+            </w:tcBorders>
+          </w:tcPr>
+          <w:p>
+            <w:r>
+              <w:rPr>
+                <w:rFonts w:ascii="Georgia" w:hAnsi="Georgia"/>
+                <w:b w:val="0"/>
+                <w:i/>
+                <w:color w:val="705638"/>
+                <w:sz w:val="20"/>
+              </w:rPr>
+              <w:t>XI</w:t>
+            </w:r>
+          </w:p>
+        </w:tc>
+        <w:tc>
+          <w:tcPr>
+            <w:tcW w:type="dxa" w:w="1440"/>
+            <w:tcBorders>
+              <w:top w:val="single" w:sz="4" w:color="C9B894"/>
+              <w:left w:val="single" w:sz="4" w:color="C9B894"/>
+              <w:bottom w:val="single" w:sz="4" w:color="C9B894"/>
+              <w:right w:val="single" w:sz="4" w:color="C9B894"/>
+            </w:tcBorders>
+            <w:shd w:val="clear" w:color="auto" w:fill="DCFCE7"/>
+          </w:tcPr>
+          <w:p>
+            <w:r>
+              <w:rPr>
+                <w:rFonts w:ascii="Georgia" w:hAnsi="Georgia"/>
+                <w:b/>
+                <w:i w:val="0"/>
+                <w:color w:val="15803D"/>
+                <w:sz w:val="20"/>
+              </w:rPr>
+              <w:t>Fix — Map markers vanished on server path</w:t>
+            </w:r>
+          </w:p>
+        </w:tc>
+        <w:tc>
+          <w:tcPr>
+            <w:tcW w:type="dxa" w:w="6480"/>
+            <w:tcBorders>
+              <w:top w:val="single" w:sz="4" w:color="C9B894"/>
+              <w:left w:val="single" w:sz="4" w:color="C9B894"/>
+              <w:bottom w:val="single" w:sz="4" w:color="C9B894"/>
+              <w:right w:val="single" w:sz="4" w:color="C9B894"/>
+            </w:tcBorders>
+          </w:tcPr>
+          <w:p>
+            <w:r>
+              <w:rPr>
+                <w:rFonts w:ascii="Georgia" w:hAnsi="Georgia"/>
+                <w:b w:val="0"/>
+                <w:i w:val="0"/>
+                <w:color w:val="3B2F24"/>
+                <w:sz w:val="22"/>
+              </w:rPr>
+              <w:t>Cause: server's ScheduleResponse returned only crew counts &amp; total times, not the per-job sequence the browser needs to draw numbered repair circles. Resolution: flat dispatch log inside Numba scheduler, full jobs[] array in response, renderPlan() extracted so both local and server paths share one renderer.</w:t>
+            </w:r>
+          </w:p>
+        </w:tc>
+      </w:tr>
+    </w:tbl>
+    <w:p>
+      <w:r>
+        <w:rPr>
+          <w:rFonts w:ascii="Georgia" w:hAnsi="Georgia"/>
+          <w:b/>
+          <w:i w:val="0"/>
+          <w:color w:val="5B4528"/>
+          <w:sz w:val="24"/>
+        </w:rPr>
+        <w:t>Patterns across the catalogue</w:t>
+      </w:r>
+    </w:p>
+    <w:p>
+      <w:pPr>
+        <w:pStyle w:val="ListBullet"/>
+      </w:pPr>
+      <w:r>
+        <w:rPr>
+          <w:rFonts w:ascii="Georgia" w:hAnsi="Georgia"/>
+          <w:b w:val="0"/>
+          <w:i w:val="0"/>
+          <w:color w:val="3B2F24"/>
+          <w:sz w:val="22"/>
+        </w:rPr>
+        <w:t>"Optional dependencies" need to actually be optional in code, not just in spirit. Three deploy failures in a row stemmed from one file's unconditional import of matplotlib + load of a data file. The clean fix was removing the import entirely.</w:t>
+      </w:r>
+    </w:p>
+    <w:p>
+      <w:pPr>
+        <w:pStyle w:val="ListBullet"/>
+      </w:pPr>
+      <w:r>
+        <w:rPr>
+          <w:rFonts w:ascii="Georgia" w:hAnsi="Georgia"/>
+          <w:b w:val="0"/>
+          <w:i w:val="0"/>
+          <w:color w:val="3B2F24"/>
+          <w:sz w:val="22"/>
+        </w:rPr>
+        <w:t>Real measurements beat plausible estimates. Three of the biggest "this will help a lot" optimisations (WASM, KD-tree, process pool) all ended up neutral or worse. The only way we knew was benchmarking after each.</w:t>
+      </w:r>
+    </w:p>
+    <w:p>
+      <w:pPr>
+        <w:pStyle w:val="ListBullet"/>
+      </w:pPr>
+      <w:r>
+        <w:rPr>
+          <w:rFonts w:ascii="Georgia" w:hAnsi="Georgia"/>
+          <w:b w:val="0"/>
+          <w:i w:val="0"/>
+          <w:color w:val="3B2F24"/>
+          <w:sz w:val="22"/>
+        </w:rPr>
+        <w:t>The hardest bugs are about semantics, not syntax. The four-deploy SystemExit saga was caused by Python's exception hierarchy doing exactly what it's designed to do.</w:t>
+      </w:r>
+    </w:p>
+    <w:p>
+      <w:pPr>
+        <w:pStyle w:val="ListBullet"/>
+      </w:pPr>
+      <w:r>
+        <w:rPr>
+          <w:rFonts w:ascii="Georgia" w:hAnsi="Georgia"/>
+          <w:b w:val="0"/>
+          <w:i w:val="0"/>
+          <w:color w:val="3B2F24"/>
+          <w:sz w:val="22"/>
+        </w:rPr>
+        <w:t>Many performance problems are really "we're doing work that doesn't need to be done" problems. The 246× win in Chapter VIII came from skipping the grid scan when there was nothing to find, not from making the scan faster.</w:t>
+      </w:r>
+    </w:p>
+    <w:p>
+      <w:pPr>
+        <w:pStyle w:val="ListBullet"/>
+      </w:pPr>
+      <w:r>
+        <w:rPr>
+          <w:rFonts w:ascii="Georgia" w:hAnsi="Georgia"/>
+          <w:b w:val="0"/>
+          <w:i w:val="0"/>
+          <w:color w:val="3B2F24"/>
+          <w:sz w:val="22"/>
+        </w:rPr>
+        <w:t>Visualisation parity is part of correctness. The vanishing markers regression wasn't caught by tests — it was caught by a user looking at the map. Speed without the right output isn't a win.</w:t>
       </w:r>
     </w:p>
     <w:sectPr>

</xml_diff>

<commit_message>
Statewide Phases 2-4: HRRR/flood coverage, Worker perf, server cache, docs
Phase 2: densify the HRRR wind/temp grid from Hartford-only 15x21 to a
statewide 41x65 grid (same 5 storms), and add 12 real USGS-traced river
corridors covering the other 7 counties alongside the existing 5 Hartford
corridors (17 total).

Phase 3: move the O(rows*cols*substations) territory-coloring computation
into a Web Worker (the real bottleneck at 299 vs 49 substations), replace
~10,000 individual Leaflet polylines for feeders/laterals with a
canvas-batched layer, and add a disk-backed result cache to the FastAPI
backend for /api/schedule and /api/monte_carlo.

Phase 4: update README, DATA_SOURCES, ROADMAP, both journals (md + html),
the methodology notebook, and the two generated .docx deliverables for the
statewide scope. Two pptx decks also got factual corrections (substation/
tract counts, HRRR grid dimensions) but aren't tracked by git here.
</commit_message>
<xml_diff>
--- a/Hartford_Grid_Dev_Journal.docx
+++ b/Hartford_Grid_Dev_Journal.docx
@@ -23,7 +23,7 @@
           <w:color w:val="705638"/>
           <w:sz w:val="24"/>
         </w:rPr>
-        <w:t>Hartford County Power Grid Resilience Simulation</w:t>
+        <w:t>Connecticut Power Grid Resilience Simulation</w:t>
       </w:r>
     </w:p>
     <w:p>
@@ -14490,6 +14490,255 @@
           <w:sz w:val="22"/>
         </w:rPr>
         <w:t>Visualisation parity is part of correctness. The vanishing markers regression wasn't caught by tests — it was caught by a user looking at the map. Speed without the right output isn't a win.</w:t>
+      </w:r>
+    </w:p>
+    <w:p>
+      <w:pPr>
+        <w:jc w:val="center"/>
+      </w:pPr>
+      <w:r>
+        <w:rPr>
+          <w:rFonts w:ascii="Georgia" w:hAnsi="Georgia"/>
+          <w:b w:val="0"/>
+          <w:i w:val="0"/>
+          <w:color w:val="8B3A2E"/>
+          <w:sz w:val="28"/>
+        </w:rPr>
+        <w:t>❦</w:t>
+      </w:r>
+    </w:p>
+    <w:p>
+      <w:r>
+        <w:rPr>
+          <w:rFonts w:ascii="Georgia" w:hAnsi="Georgia"/>
+          <w:b/>
+          <w:i w:val="0"/>
+          <w:color w:val="8B3A2E"/>
+          <w:sz w:val="30"/>
+        </w:rPr>
+        <w:t>Addendum — Statewide Expansion</w:t>
+      </w:r>
+    </w:p>
+    <w:p>
+      <w:r>
+        <w:rPr>
+          <w:rFonts w:ascii="Georgia" w:hAnsi="Georgia"/>
+          <w:b w:val="0"/>
+          <w:i/>
+          <w:color w:val="705638"/>
+          <w:sz w:val="20"/>
+        </w:rPr>
+        <w:t>Hartford County to all of Connecticut, with the same real-data rigor everywhere -- not a bigger boundary drawn around the old data.</w:t>
+      </w:r>
+    </w:p>
+    <w:p>
+      <w:r>
+        <w:rPr>
+          <w:rFonts w:ascii="Georgia" w:hAnsi="Georgia"/>
+          <w:b w:val="0"/>
+          <w:i w:val="0"/>
+          <w:color w:val="3B2F24"/>
+          <w:sz w:val="22"/>
+        </w:rPr>
+        <w:t>The user asked to expand the simulator from Hartford County to the entire state, with one explicit, non-negotiable requirement:</w:t>
+      </w:r>
+    </w:p>
+    <w:tbl>
+      <w:tblPr>
+        <w:tblW w:type="auto" w:w="0"/>
+        <w:tblLook w:firstColumn="1" w:firstRow="1" w:lastColumn="0" w:lastRow="0" w:noHBand="0" w:noVBand="1" w:val="04A0"/>
+      </w:tblPr>
+      <w:tblGrid>
+        <w:gridCol w:w="9648"/>
+      </w:tblGrid>
+      <w:tr>
+        <w:tc>
+          <w:tcPr>
+            <w:tcW w:type="dxa" w:w="9216"/>
+            <w:shd w:val="clear" w:color="auto" w:fill="FFF7E2"/>
+            <w:tcBorders>
+              <w:top w:val="single" w:sz="4" w:color="8B3A2E"/>
+              <w:left w:val="single" w:sz="4" w:color="8B3A2E"/>
+              <w:bottom w:val="single" w:sz="4" w:color="8B3A2E"/>
+              <w:right w:val="single" w:sz="4" w:color="8B3A2E"/>
+            </w:tcBorders>
+          </w:tcPr>
+          <w:p>
+            <w:r>
+              <w:rPr>
+                <w:rFonts w:ascii="Georgia" w:hAnsi="Georgia"/>
+                <w:b/>
+                <w:i w:val="0"/>
+                <w:color w:val="7C2D12"/>
+                <w:sz w:val="20"/>
+              </w:rPr>
+              <w:t xml:space="preserve">User: </w:t>
+            </w:r>
+            <w:r>
+              <w:rPr>
+                <w:rFonts w:ascii="Georgia" w:hAnsi="Georgia"/>
+                <w:b w:val="0"/>
+                <w:i/>
+                <w:color w:val="3B2F24"/>
+                <w:sz w:val="22"/>
+              </w:rPr>
+              <w:t>wait make sure the new counties all have the real substations within them. I want all the realistic features hartford county is based on to be found within the other counties that make up connecticut.</w:t>
+            </w:r>
+          </w:p>
+        </w:tc>
+      </w:tr>
+    </w:tbl>
+    <w:p>
+      <w:r>
+        <w:rPr>
+          <w:rFonts w:ascii="Georgia" w:hAnsi="Georgia"/>
+          <w:b w:val="0"/>
+          <w:i w:val="0"/>
+          <w:color w:val="3B2F24"/>
+          <w:sz w:val="22"/>
+        </w:rPr>
+        <w:t>Scoped as a 4-phase plan with checkpoints, so the full roadmap was visible up front but only Phase 1 started immediately: (1) real data + core refactor, (2) statewide HRRR wind grid + flood corridors, (3) performance, (4) this documentation pass.</w:t>
+      </w:r>
+    </w:p>
+    <w:p>
+      <w:r>
+        <w:rPr>
+          <w:rFonts w:ascii="Georgia" w:hAnsi="Georgia"/>
+          <w:b/>
+          <w:i w:val="0"/>
+          <w:color w:val="5B4528"/>
+          <w:sz w:val="24"/>
+        </w:rPr>
+        <w:t>Phase 1 -- real data, statewide</w:t>
+      </w:r>
+    </w:p>
+    <w:p>
+      <w:r>
+        <w:rPr>
+          <w:rFonts w:ascii="Georgia" w:hAnsi="Georgia"/>
+          <w:b w:val="0"/>
+          <w:i w:val="0"/>
+          <w:color w:val="3B2F24"/>
+          <w:sz w:val="22"/>
+        </w:rPr>
+        <w:t>Re-fetched the state boundary, all 169 real town polygons (filtered against the real state polygon to drop 44 bounding-box-spillover towns in Massachusetts, Rhode Island, and New York), and 299 real HIFLD substations statewide. Wrote three new fetch scripts for critical facilities (1,143, HIFLD/EPA), tree canopy (live NLCD WMS buffer-mean per substation), and census tracts (883 real tracts + 169 town populations, pulled from the Census Bureau's keyless P.L. 94-171 static file -- this sidestepped the Census API key requirement that had briefly looked like a hard blocker).</w:t>
+      </w:r>
+    </w:p>
+    <w:p>
+      <w:pPr>
+        <w:pStyle w:val="ListBullet"/>
+      </w:pPr>
+      <w:r>
+        <w:rPr>
+          <w:rFonts w:ascii="Georgia" w:hAnsi="Georgia"/>
+          <w:b w:val="0"/>
+          <w:i w:val="0"/>
+          <w:color w:val="3B2F24"/>
+          <w:sz w:val="22"/>
+        </w:rPr>
+        <w:t>Bug: HIFLD substation names aren't unique. Five different real substations are all literally named "Bridgeport substation" at different coordinates. A name-keyed tree-canopy lookup silently collapsed 299 substations down to 223 before this was caught -- fixed by keying on coordinates instead, in both the fetch script and the frontend.</w:t>
+      </w:r>
+    </w:p>
+    <w:p>
+      <w:pPr>
+        <w:pStyle w:val="ListBullet"/>
+      </w:pPr>
+      <w:r>
+        <w:rPr>
+          <w:rFonts w:ascii="Georgia" w:hAnsi="Georgia"/>
+          <w:b w:val="0"/>
+          <w:i w:val="0"/>
+          <w:color w:val="3B2F24"/>
+          <w:sz w:val="22"/>
+        </w:rPr>
+        <w:t>Bug: EPA wastewater-plant status field misread. cwp_status turned out to be regulatory compliance status ("Noncompliance" / "No Violation"), not an operational open/closed flag -- a filter on it was silently dropping every real CT water treatment plant.</w:t>
+      </w:r>
+    </w:p>
+    <w:p>
+      <w:pPr>
+        <w:pStyle w:val="ListBullet"/>
+      </w:pPr>
+      <w:r>
+        <w:rPr>
+          <w:rFonts w:ascii="Georgia" w:hAnsi="Georgia"/>
+          <w:b w:val="0"/>
+          <w:i w:val="0"/>
+          <w:color w:val="3B2F24"/>
+          <w:sz w:val="22"/>
+        </w:rPr>
+        <w:t>Two fabricated datasets found and replaced. The original hartford_critical_facilities.js had no backing fetch script and didn't match any live HIFLD query. The original hartford_census_tracts.js had 10-digit "GEOIDs" (real ones are 11 digits) and an embedded county-FIPS substring that didn't match Hartford's real FIPS code. Both were almost certainly hand-typed despite header comments citing real source URLs.</w:t>
+      </w:r>
+    </w:p>
+    <w:p>
+      <w:r>
+        <w:rPr>
+          <w:rFonts w:ascii="Georgia" w:hAnsi="Georgia"/>
+          <w:b/>
+          <w:i w:val="0"/>
+          <w:color w:val="5B4528"/>
+          <w:sz w:val="24"/>
+        </w:rPr>
+        <w:t>Phase 2 -- HRRR wind grid + flood corridors</w:t>
+      </w:r>
+    </w:p>
+    <w:p>
+      <w:r>
+        <w:rPr>
+          <w:rFonts w:ascii="Georgia" w:hAnsi="Georgia"/>
+          <w:b w:val="0"/>
+          <w:i w:val="0"/>
+          <w:color w:val="3B2F24"/>
+          <w:sz w:val="22"/>
+        </w:rPr>
+        <w:t>Ported the Hartford-only 15x21 HRRR wind/temperature notebook to a plain script and densified it to a 41x65 statewide grid at HRRR's native ~3km resolution, for the same 5 storms (Isaias 2020, Henri 2021, May 2018, Jan 2024, Dec 2023). Soil moisture wasn't present in this HRRR product for any of the 5 storm hours -- confirmed against the raw GRIB index rather than just a failed field-name guess -- and the one semantically-close substitute field returned a suspicious flat 100% everywhere, so it was left null rather than filled with a low-confidence guess.</w:t>
+      </w:r>
+    </w:p>
+    <w:p>
+      <w:r>
+        <w:rPr>
+          <w:rFonts w:ascii="Georgia" w:hAnsi="Georgia"/>
+          <w:b w:val="0"/>
+          <w:i w:val="0"/>
+          <w:color w:val="3B2F24"/>
+          <w:sz w:val="22"/>
+        </w:rPr>
+        <w:t>Added 12 real river corridors for the other 7 counties, traced from the USGS National Hydrography Dataset. NHD represents each named river as many short connected reach segments (15-126 per river here) -- the fetch script chains matching reaches end-to-end by snapping close endpoints, keeps the longest connected chain per river, and simplifies to ~19 points, merged with the 5 existing hand-placed Hartford corridors.</w:t>
+      </w:r>
+    </w:p>
+    <w:p>
+      <w:r>
+        <w:rPr>
+          <w:rFonts w:ascii="Georgia" w:hAnsi="Georgia"/>
+          <w:b/>
+          <w:i w:val="0"/>
+          <w:color w:val="5B4528"/>
+          <w:sz w:val="24"/>
+        </w:rPr>
+        <w:t>Phase 3 -- performance</w:t>
+      </w:r>
+    </w:p>
+    <w:p>
+      <w:r>
+        <w:rPr>
+          <w:rFonts w:ascii="Georgia" w:hAnsi="Georgia"/>
+          <w:b w:val="0"/>
+          <w:i w:val="0"/>
+          <w:color w:val="3B2F24"/>
+          <w:sz w:val="22"/>
+        </w:rPr>
+        <w:t>The real bottleneck at statewide scale wasn't the feeder/lateral generation math (a few tens of thousands of cheap operations) -- it was the nearest-substation territory-coloring loop, O(rows x cols x substations), which scales roughly with substation count squared: ~37x more work at 299 substations than the original 49. Moved that computation into a Web Worker, with a synchronous fallback if Workers aren't available. Separately, ~10,000 individual Leaflet polyline objects for feeders/laterals (up from ~3,500 at the old scale) were replaced with a canvas-batched layer mirroring the existing point-cloud pattern already used for outages.</w:t>
+      </w:r>
+    </w:p>
+    <w:p>
+      <w:r>
+        <w:rPr>
+          <w:rFonts w:ascii="Georgia" w:hAnsi="Georgia"/>
+          <w:b w:val="0"/>
+          <w:i w:val="0"/>
+          <w:color w:val="3B2F24"/>
+          <w:sz w:val="22"/>
+        </w:rPr>
+        <w:t>Added a disk-backed result cache to the FastAPI backend for the two most expensive endpoints, keyed by a hash of the full request body. Verified it was actually being read from disk (not just re-computing the same deterministic result) by tampering with a cached file directly and confirming the tampered value came back on the next identical request.</w:t>
       </w:r>
     </w:p>
     <w:sectPr>

</xml_diff>